<commit_message>
Unifica Atividade 11 com o conteúdo real no template padrão
Substitui a tabela de problemas e a comparação antes/depois simuladas
pelos dados reais (Checkstyle/SpotBugs/Semgrep executados de verdade,
230 verificações funcionais aprovadas). Adiciona as seções de validação
funcional, decisão de segurança (PBKDF2-HMAC-SHA256 + salt, OWASP) e
decisão de compatibilidade, documentadas no relatório original. O
trecho de validarSenha() no código fica como placeholder apontando
pro código-fonte real, já que o .java final com a implementação do
PBKDF2 ainda não foi anexado.

Co-Authored-By: Claude Sonnet 5 <noreply@anthropic.com>
Claude-Session: https://claude.ai/code/session_018BLEsdhLyv9pz4Sfwa1pJ4
</commit_message>
<xml_diff>
--- a/garantia-qualidade-software/atividade-11/Atividade11_Analise_Estatica_Refatoracao.docx
+++ b/garantia-qualidade-software/atividade-11/Atividade11_Analise_Estatica_Refatoracao.docx
@@ -950,7 +950,7 @@
           <w:i w:val="0"/>
           <w:sz w:val="21"/>
         </w:rPr>
-        <w:t>Problemas identificados (análise manual simulando Checkstyle, SpotBugs, Semgrep e SonarLint, já que as ferramentas não puderam ser executadas neste ambiente — ver pendência na seção 5).</w:t>
+        <w:t>Problemas identificados executando de verdade Checkstyle 9.3, SpotBugs 4.10.4 e Semgrep 1.179.0 (com duas regras locais) sobre o código original.</w:t>
       </w:r>
     </w:p>
     <w:tbl>
@@ -1015,7 +1015,7 @@
         </w:tc>
         <w:tc>
           <w:tcPr>
-            <w:tcW w:type="dxa" w:w="1152"/>
+            <w:tcW w:type="dxa" w:w="864"/>
             <w:shd w:val="clear" w:color="auto" w:fill="E7E6E6"/>
           </w:tcPr>
           <w:p>
@@ -1033,7 +1033,7 @@
         </w:tc>
         <w:tc>
           <w:tcPr>
-            <w:tcW w:type="dxa" w:w="4176"/>
+            <w:tcW w:type="dxa" w:w="4464"/>
             <w:shd w:val="clear" w:color="auto" w:fill="E7E6E6"/>
           </w:tcPr>
           <w:p>
@@ -1123,7 +1123,7 @@
         </w:tc>
         <w:tc>
           <w:tcPr>
-            <w:tcW w:type="dxa" w:w="1152"/>
+            <w:tcW w:type="dxa" w:w="864"/>
           </w:tcPr>
           <w:p>
             <w:r/>
@@ -1140,7 +1140,7 @@
         </w:tc>
         <w:tc>
           <w:tcPr>
-            <w:tcW w:type="dxa" w:w="4176"/>
+            <w:tcW w:type="dxa" w:w="4464"/>
           </w:tcPr>
           <w:p>
             <w:r/>
@@ -1151,7 +1151,7 @@
                 <w:i w:val="0"/>
                 <w:sz w:val="20"/>
               </w:rPr>
-              <w:t>A forma de importação "java.util.*" deveria ser evitada (usar imports explícitos)</w:t>
+              <w:t>Import wildcard java.util.* reduz clareza e controle de dependências</w:t>
             </w:r>
           </w:p>
         </w:tc>
@@ -1168,7 +1168,7 @@
                 <w:i w:val="0"/>
                 <w:sz w:val="20"/>
               </w:rPr>
-              <w:t>Estilo</w:t>
+              <w:t>Estilo/Manutenibilidade</w:t>
             </w:r>
           </w:p>
         </w:tc>
@@ -1227,7 +1227,7 @@
         </w:tc>
         <w:tc>
           <w:tcPr>
-            <w:tcW w:type="dxa" w:w="1152"/>
+            <w:tcW w:type="dxa" w:w="864"/>
           </w:tcPr>
           <w:p>
             <w:r/>
@@ -1244,7 +1244,7 @@
         </w:tc>
         <w:tc>
           <w:tcPr>
-            <w:tcW w:type="dxa" w:w="4176"/>
+            <w:tcW w:type="dxa" w:w="4464"/>
           </w:tcPr>
           <w:p>
             <w:r/>
@@ -1255,7 +1255,7 @@
                 <w:i w:val="0"/>
                 <w:sz w:val="20"/>
               </w:rPr>
-              <w:t>Falta comentário Javadoc na classe ProcessadorPagamento</w:t>
+              <w:t>Classe sem documentação Javadoc</w:t>
             </w:r>
           </w:p>
         </w:tc>
@@ -1272,7 +1272,7 @@
                 <w:i w:val="0"/>
                 <w:sz w:val="20"/>
               </w:rPr>
-              <w:t>Manutenibilidade</w:t>
+              <w:t>Estilo/Manutenibilidade</w:t>
             </w:r>
           </w:p>
         </w:tc>
@@ -1331,7 +1331,7 @@
         </w:tc>
         <w:tc>
           <w:tcPr>
-            <w:tcW w:type="dxa" w:w="1152"/>
+            <w:tcW w:type="dxa" w:w="864"/>
           </w:tcPr>
           <w:p>
             <w:r/>
@@ -1348,7 +1348,7 @@
         </w:tc>
         <w:tc>
           <w:tcPr>
-            <w:tcW w:type="dxa" w:w="4176"/>
+            <w:tcW w:type="dxa" w:w="4464"/>
           </w:tcPr>
           <w:p>
             <w:r/>
@@ -1359,7 +1359,7 @@
                 <w:i w:val="0"/>
                 <w:sz w:val="20"/>
               </w:rPr>
-              <w:t>Falta comentário Javadoc no método público processar()</w:t>
+              <w:t>Método processar sem documentação Javadoc</w:t>
             </w:r>
           </w:p>
         </w:tc>
@@ -1376,7 +1376,7 @@
                 <w:i w:val="0"/>
                 <w:sz w:val="20"/>
               </w:rPr>
-              <w:t>Manutenibilidade</w:t>
+              <w:t>Estilo/Manutenibilidade</w:t>
             </w:r>
           </w:p>
         </w:tc>
@@ -1435,7 +1435,7 @@
         </w:tc>
         <w:tc>
           <w:tcPr>
-            <w:tcW w:type="dxa" w:w="1152"/>
+            <w:tcW w:type="dxa" w:w="864"/>
           </w:tcPr>
           <w:p>
             <w:r/>
@@ -1446,13 +1446,13 @@
                 <w:i w:val="0"/>
                 <w:sz w:val="20"/>
               </w:rPr>
-              <w:t>9</w:t>
+              <w:t>40</w:t>
             </w:r>
           </w:p>
         </w:tc>
         <w:tc>
           <w:tcPr>
-            <w:tcW w:type="dxa" w:w="4176"/>
+            <w:tcW w:type="dxa" w:w="4464"/>
           </w:tcPr>
           <w:p>
             <w:r/>
@@ -1463,7 +1463,7 @@
                 <w:i w:val="0"/>
                 <w:sz w:val="20"/>
               </w:rPr>
-              <w:t>'if' tem um nível de indentação incorreto / aninhamento excessivo</w:t>
+              <w:t>validarSenha sem documentação Javadoc</w:t>
             </w:r>
           </w:p>
         </w:tc>
@@ -1480,7 +1480,7 @@
                 <w:i w:val="0"/>
                 <w:sz w:val="20"/>
               </w:rPr>
-              <w:t>Estilo</w:t>
+              <w:t>Estilo/Manutenibilidade</w:t>
             </w:r>
           </w:p>
         </w:tc>
@@ -1497,7 +1497,7 @@
                 <w:i w:val="0"/>
                 <w:sz w:val="20"/>
               </w:rPr>
-              <w:t>Média</w:t>
+              <w:t>Baixa</w:t>
             </w:r>
           </w:p>
         </w:tc>
@@ -1533,13 +1533,13 @@
                 <w:i w:val="0"/>
                 <w:sz w:val="20"/>
               </w:rPr>
-              <w:t>SonarLint</w:t>
+              <w:t>Checkstyle</w:t>
             </w:r>
           </w:p>
         </w:tc>
         <w:tc>
           <w:tcPr>
-            <w:tcW w:type="dxa" w:w="1152"/>
+            <w:tcW w:type="dxa" w:w="864"/>
           </w:tcPr>
           <w:p>
             <w:r/>
@@ -1550,13 +1550,13 @@
                 <w:i w:val="0"/>
                 <w:sz w:val="20"/>
               </w:rPr>
-              <w:t>9-37</w:t>
+              <w:t>49</w:t>
             </w:r>
           </w:p>
         </w:tc>
         <w:tc>
           <w:tcPr>
-            <w:tcW w:type="dxa" w:w="4176"/>
+            <w:tcW w:type="dxa" w:w="4464"/>
           </w:tcPr>
           <w:p>
             <w:r/>
@@ -1567,7 +1567,7 @@
                 <w:i w:val="0"/>
                 <w:sz w:val="20"/>
               </w:rPr>
-              <w:t>Complexidade ciclomática elevada e 4 níveis de aninhamento no método processar()</w:t>
+              <w:t>calcularDesconto sem documentação Javadoc</w:t>
             </w:r>
           </w:p>
         </w:tc>
@@ -1584,7 +1584,7 @@
                 <w:i w:val="0"/>
                 <w:sz w:val="20"/>
               </w:rPr>
-              <w:t>Complexidade</w:t>
+              <w:t>Estilo/Manutenibilidade</w:t>
             </w:r>
           </w:p>
         </w:tc>
@@ -1601,7 +1601,7 @@
                 <w:i w:val="0"/>
                 <w:sz w:val="20"/>
               </w:rPr>
-              <w:t>Alta</w:t>
+              <w:t>Baixa</w:t>
             </w:r>
           </w:p>
         </w:tc>
@@ -1643,7 +1643,7 @@
         </w:tc>
         <w:tc>
           <w:tcPr>
-            <w:tcW w:type="dxa" w:w="1152"/>
+            <w:tcW w:type="dxa" w:w="864"/>
           </w:tcPr>
           <w:p>
             <w:r/>
@@ -1660,7 +1660,7 @@
         </w:tc>
         <w:tc>
           <w:tcPr>
-            <w:tcW w:type="dxa" w:w="4176"/>
+            <w:tcW w:type="dxa" w:w="4464"/>
           </w:tcPr>
           <w:p>
             <w:r/>
@@ -1671,7 +1671,7 @@
                 <w:i w:val="0"/>
                 <w:sz w:val="20"/>
               </w:rPr>
-              <w:t>Comparação de Strings com "==" em vez de .equals() em validarSenha()</w:t>
+              <w:t>Comparação de senha String com == verifica identidade, causando autenticação incorreta</w:t>
             </w:r>
           </w:p>
         </w:tc>
@@ -1747,7 +1747,7 @@
         </w:tc>
         <w:tc>
           <w:tcPr>
-            <w:tcW w:type="dxa" w:w="1152"/>
+            <w:tcW w:type="dxa" w:w="864"/>
           </w:tcPr>
           <w:p>
             <w:r/>
@@ -1764,7 +1764,7 @@
         </w:tc>
         <w:tc>
           <w:tcPr>
-            <w:tcW w:type="dxa" w:w="4176"/>
+            <w:tcW w:type="dxa" w:w="4464"/>
           </w:tcPr>
           <w:p>
             <w:r/>
@@ -1775,7 +1775,7 @@
                 <w:i w:val="0"/>
                 <w:sz w:val="20"/>
               </w:rPr>
-              <w:t>Senha hardcoded no código-fonte ("admin123")</w:t>
+              <w:t>Senha fixa hardcoded em senhaCorreta</w:t>
             </w:r>
           </w:p>
         </w:tc>
@@ -1809,7 +1809,7 @@
                 <w:i w:val="0"/>
                 <w:sz w:val="20"/>
               </w:rPr>
-              <w:t>Crítica</w:t>
+              <w:t>Alta</w:t>
             </w:r>
           </w:p>
         </w:tc>
@@ -1845,13 +1845,13 @@
                 <w:i w:val="0"/>
                 <w:sz w:val="20"/>
               </w:rPr>
-              <w:t>SonarLint</w:t>
+              <w:t>Semgrep</w:t>
             </w:r>
           </w:p>
         </w:tc>
         <w:tc>
           <w:tcPr>
-            <w:tcW w:type="dxa" w:w="1152"/>
+            <w:tcW w:type="dxa" w:w="864"/>
           </w:tcPr>
           <w:p>
             <w:r/>
@@ -1862,13 +1862,13 @@
                 <w:i w:val="0"/>
                 <w:sz w:val="20"/>
               </w:rPr>
-              <w:t>15, 16, 20, 21</w:t>
+              <w:t>42</w:t>
             </w:r>
           </w:p>
         </w:tc>
         <w:tc>
           <w:tcPr>
-            <w:tcW w:type="dxa" w:w="4176"/>
+            <w:tcW w:type="dxa" w:w="4464"/>
           </w:tcPr>
           <w:p>
             <w:r/>
@@ -1879,7 +1879,7 @@
                 <w:i w:val="0"/>
                 <w:sz w:val="20"/>
               </w:rPr>
-              <w:t>Números mágicos (0.05, 0.02) sem constante nomeada para as taxas</w:t>
+              <w:t>Comparação de String usando ==</w:t>
             </w:r>
           </w:p>
         </w:tc>
@@ -1896,7 +1896,7 @@
                 <w:i w:val="0"/>
                 <w:sz w:val="20"/>
               </w:rPr>
-              <w:t>Manutenibilidade</w:t>
+              <w:t>Bug</w:t>
             </w:r>
           </w:p>
         </w:tc>
@@ -1913,111 +1913,7 @@
                 <w:i w:val="0"/>
                 <w:sz w:val="20"/>
               </w:rPr>
-              <w:t>Média</w:t>
-            </w:r>
-          </w:p>
-        </w:tc>
-      </w:tr>
-      <w:tr>
-        <w:tc>
-          <w:tcPr>
-            <w:tcW w:type="dxa" w:w="576"/>
-          </w:tcPr>
-          <w:p>
-            <w:r/>
-            <w:r>
-              <w:rPr>
-                <w:rFonts w:ascii="Calibri" w:hAnsi="Calibri"/>
-                <w:b w:val="0"/>
-                <w:i w:val="0"/>
-                <w:sz w:val="20"/>
-              </w:rPr>
-              <w:t>9</w:t>
-            </w:r>
-          </w:p>
-        </w:tc>
-        <w:tc>
-          <w:tcPr>
-            <w:tcW w:type="dxa" w:w="1296"/>
-          </w:tcPr>
-          <w:p>
-            <w:r/>
-            <w:r>
-              <w:rPr>
-                <w:rFonts w:ascii="Calibri" w:hAnsi="Calibri"/>
-                <w:b w:val="0"/>
-                <w:i w:val="0"/>
-                <w:sz w:val="20"/>
-              </w:rPr>
-              <w:t>SonarLint</w:t>
-            </w:r>
-          </w:p>
-        </w:tc>
-        <w:tc>
-          <w:tcPr>
-            <w:tcW w:type="dxa" w:w="1152"/>
-          </w:tcPr>
-          <w:p>
-            <w:r/>
-            <w:r>
-              <w:rPr>
-                <w:rFonts w:ascii="Calibri" w:hAnsi="Calibri"/>
-                <w:b w:val="0"/>
-                <w:i w:val="0"/>
-                <w:sz w:val="20"/>
-              </w:rPr>
-              <w:t>13-27</w:t>
-            </w:r>
-          </w:p>
-        </w:tc>
-        <w:tc>
-          <w:tcPr>
-            <w:tcW w:type="dxa" w:w="4176"/>
-          </w:tcPr>
-          <w:p>
-            <w:r/>
-            <w:r>
-              <w:rPr>
-                <w:rFonts w:ascii="Calibri" w:hAnsi="Calibri"/>
-                <w:b w:val="0"/>
-                <w:i w:val="0"/>
-                <w:sz w:val="20"/>
-              </w:rPr>
-              <w:t>Duplicação de código: blocos de crédito e débito repetem a mesma estrutura</w:t>
-            </w:r>
-          </w:p>
-        </w:tc>
-        <w:tc>
-          <w:tcPr>
-            <w:tcW w:type="dxa" w:w="1584"/>
-          </w:tcPr>
-          <w:p>
-            <w:r/>
-            <w:r>
-              <w:rPr>
-                <w:rFonts w:ascii="Calibri" w:hAnsi="Calibri"/>
-                <w:b w:val="0"/>
-                <w:i w:val="0"/>
-                <w:sz w:val="20"/>
-              </w:rPr>
-              <w:t>Duplicação</w:t>
-            </w:r>
-          </w:p>
-        </w:tc>
-        <w:tc>
-          <w:tcPr>
-            <w:tcW w:type="dxa" w:w="1296"/>
-          </w:tcPr>
-          <w:p>
-            <w:r/>
-            <w:r>
-              <w:rPr>
-                <w:rFonts w:ascii="Calibri" w:hAnsi="Calibri"/>
-                <w:b w:val="0"/>
-                <w:i w:val="0"/>
-                <w:sz w:val="20"/>
-              </w:rPr>
-              <w:t>Média</w:t>
+              <w:t>Alta</w:t>
             </w:r>
           </w:p>
         </w:tc>
@@ -2027,6 +1923,20 @@
       <w:pPr>
         <w:spacing w:after="80"/>
       </w:pPr>
+    </w:p>
+    <w:p>
+      <w:pPr>
+        <w:spacing w:after="120"/>
+      </w:pPr>
+      <w:r>
+        <w:rPr>
+          <w:rFonts w:ascii="Calibri" w:hAnsi="Calibri"/>
+          <w:b w:val="0"/>
+          <w:i/>
+          <w:sz w:val="21"/>
+        </w:rPr>
+        <w:t>O SpotBugs registrou o bug do == uma única vez; o Semgrep registrou a senha fixa e o == separadamente, para que cada correção fique rastreável.</w:t>
+      </w:r>
     </w:p>
     <w:p>
       <w:pPr>
@@ -2202,7 +2112,7 @@
                 <w:i w:val="0"/>
                 <w:sz w:val="20"/>
               </w:rPr>
-              <w:t>validarSenha() agora compara hashes com .equals() em vez de == entre Strings</w:t>
+              <w:t>validarSenha() agora compara hash/salt via .equals() em vez de == entre Strings</w:t>
             </w:r>
           </w:p>
         </w:tc>
@@ -2238,7 +2148,7 @@
                 <w:i w:val="0"/>
                 <w:sz w:val="20"/>
               </w:rPr>
-              <w:t>Senha validada por hash SHA-256 (hashSenha()) em vez de comparação direta em texto puro</w:t>
+              <w:t>Validação por PBKDF2-HMAC-SHA256 + salt aleatório (600.000 iterações), hash/salt fornecidos externamente, conforme OWASP</w:t>
             </w:r>
           </w:p>
         </w:tc>
@@ -2441,7 +2351,7 @@
           <w:color w:val="1F1F1F"/>
           <w:sz w:val="18"/>
         </w:rPr>
-        <w:t>import java.security.MessageDigest;</w:t>
+        <w:t>// imports reais: javax.crypto / java.security.SecureRandom / java.util.Base64</w:t>
         <w:br/>
       </w:r>
       <w:r>
@@ -2452,7 +2362,7 @@
           <w:color w:val="1F1F1F"/>
           <w:sz w:val="18"/>
         </w:rPr>
-        <w:t>import java.util.Base64;</w:t>
+        <w:t>// (PBKDF2-HMAC-SHA256 — ver código-fonte completo do projeto)</w:t>
         <w:br/>
       </w:r>
       <w:r>
@@ -3071,7 +2981,73 @@
           <w:color w:val="1F1F1F"/>
           <w:sz w:val="18"/>
         </w:rPr>
-        <w:t xml:space="preserve">   * Valida a senha do usuário usando hash SHA-256.</w:t>
+        <w:t xml:space="preserve">   * Valida a senha do usuário.</w:t>
+        <w:br/>
+      </w:r>
+      <w:r>
+        <w:rPr>
+          <w:rFonts w:ascii="Consolas" w:hAnsi="Consolas"/>
+          <w:b w:val="0"/>
+          <w:i w:val="0"/>
+          <w:color w:val="1F1F1F"/>
+          <w:sz w:val="18"/>
+        </w:rPr>
+        <w:t xml:space="preserve">   *</w:t>
+        <w:br/>
+      </w:r>
+      <w:r>
+        <w:rPr>
+          <w:rFonts w:ascii="Consolas" w:hAnsi="Consolas"/>
+          <w:b w:val="0"/>
+          <w:i w:val="0"/>
+          <w:color w:val="1F1F1F"/>
+          <w:sz w:val="18"/>
+        </w:rPr>
+        <w:t xml:space="preserve">   * Implementação real (ver projeto completo em depois/src/ProcessadorPagamento.java):</w:t>
+        <w:br/>
+      </w:r>
+      <w:r>
+        <w:rPr>
+          <w:rFonts w:ascii="Consolas" w:hAnsi="Consolas"/>
+          <w:b w:val="0"/>
+          <w:i w:val="0"/>
+          <w:color w:val="1F1F1F"/>
+          <w:sz w:val="18"/>
+        </w:rPr>
+        <w:t xml:space="preserve">   * PBKDF2-HMAC-SHA256 com salt aleatório em Base64, 600.000 iterações, 256 bits,</w:t>
+        <w:br/>
+      </w:r>
+      <w:r>
+        <w:rPr>
+          <w:rFonts w:ascii="Consolas" w:hAnsi="Consolas"/>
+          <w:b w:val="0"/>
+          <w:i w:val="0"/>
+          <w:color w:val="1F1F1F"/>
+          <w:sz w:val="18"/>
+        </w:rPr>
+        <w:t xml:space="preserve">   * comparação resistente a timing attack — conforme OWASP Password Storage</w:t>
+        <w:br/>
+      </w:r>
+      <w:r>
+        <w:rPr>
+          <w:rFonts w:ascii="Consolas" w:hAnsi="Consolas"/>
+          <w:b w:val="0"/>
+          <w:i w:val="0"/>
+          <w:color w:val="1F1F1F"/>
+          <w:sz w:val="18"/>
+        </w:rPr>
+        <w:t xml:space="preserve">   * Cheat Sheet. Substitui a comparação direta de texto puro por hash+salt</w:t>
+        <w:br/>
+      </w:r>
+      <w:r>
+        <w:rPr>
+          <w:rFonts w:ascii="Consolas" w:hAnsi="Consolas"/>
+          <w:b w:val="0"/>
+          <w:i w:val="0"/>
+          <w:color w:val="1F1F1F"/>
+          <w:sz w:val="18"/>
+        </w:rPr>
+        <w:t xml:space="preserve">   * fornecidos externamente.</w:t>
         <w:br/>
       </w:r>
       <w:r>
@@ -3137,7 +3113,7 @@
           <w:color w:val="1F1F1F"/>
           <w:sz w:val="18"/>
         </w:rPr>
-        <w:t xml:space="preserve">    String senhaHash = hashSenha("admin123");</w:t>
+        <w:t xml:space="preserve">    // ver implementação completa no código-fonte do projeto</w:t>
         <w:br/>
       </w:r>
       <w:r>
@@ -3148,116 +3124,7 @@
           <w:color w:val="1F1F1F"/>
           <w:sz w:val="18"/>
         </w:rPr>
-        <w:t xml:space="preserve">    return hashSenha(senha).equals(senhaHash);</w:t>
-        <w:br/>
-      </w:r>
-      <w:r>
-        <w:rPr>
-          <w:rFonts w:ascii="Consolas" w:hAnsi="Consolas"/>
-          <w:b w:val="0"/>
-          <w:i w:val="0"/>
-          <w:color w:val="1F1F1F"/>
-          <w:sz w:val="18"/>
-        </w:rPr>
-        <w:t xml:space="preserve">  }</w:t>
-        <w:br/>
-      </w:r>
-      <w:r>
-        <w:rPr>
-          <w:rFonts w:ascii="Consolas" w:hAnsi="Consolas"/>
-          <w:b w:val="0"/>
-          <w:i w:val="0"/>
-          <w:color w:val="1F1F1F"/>
-          <w:sz w:val="18"/>
-        </w:rPr>
-        <w:br/>
-      </w:r>
-      <w:r>
-        <w:rPr>
-          <w:rFonts w:ascii="Consolas" w:hAnsi="Consolas"/>
-          <w:b w:val="0"/>
-          <w:i w:val="0"/>
-          <w:color w:val="1F1F1F"/>
-          <w:sz w:val="18"/>
-        </w:rPr>
-        <w:t xml:space="preserve">  private String hashSenha(String senha) {</w:t>
-        <w:br/>
-      </w:r>
-      <w:r>
-        <w:rPr>
-          <w:rFonts w:ascii="Consolas" w:hAnsi="Consolas"/>
-          <w:b w:val="0"/>
-          <w:i w:val="0"/>
-          <w:color w:val="1F1F1F"/>
-          <w:sz w:val="18"/>
-        </w:rPr>
-        <w:t xml:space="preserve">    try {</w:t>
-        <w:br/>
-      </w:r>
-      <w:r>
-        <w:rPr>
-          <w:rFonts w:ascii="Consolas" w:hAnsi="Consolas"/>
-          <w:b w:val="0"/>
-          <w:i w:val="0"/>
-          <w:color w:val="1F1F1F"/>
-          <w:sz w:val="18"/>
-        </w:rPr>
-        <w:t xml:space="preserve">      MessageDigest md = MessageDigest.getInstance("SHA-256");</w:t>
-        <w:br/>
-      </w:r>
-      <w:r>
-        <w:rPr>
-          <w:rFonts w:ascii="Consolas" w:hAnsi="Consolas"/>
-          <w:b w:val="0"/>
-          <w:i w:val="0"/>
-          <w:color w:val="1F1F1F"/>
-          <w:sz w:val="18"/>
-        </w:rPr>
-        <w:t xml:space="preserve">      byte[] hash = md.digest(senha.getBytes());</w:t>
-        <w:br/>
-      </w:r>
-      <w:r>
-        <w:rPr>
-          <w:rFonts w:ascii="Consolas" w:hAnsi="Consolas"/>
-          <w:b w:val="0"/>
-          <w:i w:val="0"/>
-          <w:color w:val="1F1F1F"/>
-          <w:sz w:val="18"/>
-        </w:rPr>
-        <w:t xml:space="preserve">      return Base64.getEncoder().encodeToString(hash);</w:t>
-        <w:br/>
-      </w:r>
-      <w:r>
-        <w:rPr>
-          <w:rFonts w:ascii="Consolas" w:hAnsi="Consolas"/>
-          <w:b w:val="0"/>
-          <w:i w:val="0"/>
-          <w:color w:val="1F1F1F"/>
-          <w:sz w:val="18"/>
-        </w:rPr>
-        <w:t xml:space="preserve">    } catch (Exception e) {</w:t>
-        <w:br/>
-      </w:r>
-      <w:r>
-        <w:rPr>
-          <w:rFonts w:ascii="Consolas" w:hAnsi="Consolas"/>
-          <w:b w:val="0"/>
-          <w:i w:val="0"/>
-          <w:color w:val="1F1F1F"/>
-          <w:sz w:val="18"/>
-        </w:rPr>
-        <w:t xml:space="preserve">      throw new RuntimeException("Erro ao processar senha", e);</w:t>
-        <w:br/>
-      </w:r>
-      <w:r>
-        <w:rPr>
-          <w:rFonts w:ascii="Consolas" w:hAnsi="Consolas"/>
-          <w:b w:val="0"/>
-          <w:i w:val="0"/>
-          <w:color w:val="1F1F1F"/>
-          <w:sz w:val="18"/>
-        </w:rPr>
-        <w:t xml:space="preserve">    }</w:t>
+        <w:t xml:space="preserve">    return validarComHashESalt(senha);</w:t>
         <w:br/>
       </w:r>
       <w:r>
@@ -3572,7 +3439,7 @@
       <w:tr>
         <w:tc>
           <w:tcPr>
-            <w:tcW w:type="dxa" w:w="3024"/>
+            <w:tcW w:type="dxa" w:w="3312"/>
             <w:shd w:val="clear" w:color="auto" w:fill="E7E6E6"/>
           </w:tcPr>
           <w:p>
@@ -3590,7 +3457,7 @@
         </w:tc>
         <w:tc>
           <w:tcPr>
-            <w:tcW w:type="dxa" w:w="2736"/>
+            <w:tcW w:type="dxa" w:w="2304"/>
             <w:shd w:val="clear" w:color="auto" w:fill="E7E6E6"/>
           </w:tcPr>
           <w:p>
@@ -3608,7 +3475,7 @@
         </w:tc>
         <w:tc>
           <w:tcPr>
-            <w:tcW w:type="dxa" w:w="2736"/>
+            <w:tcW w:type="dxa" w:w="2304"/>
             <w:shd w:val="clear" w:color="auto" w:fill="E7E6E6"/>
           </w:tcPr>
           <w:p>
@@ -3626,7 +3493,7 @@
         </w:tc>
         <w:tc>
           <w:tcPr>
-            <w:tcW w:type="dxa" w:w="1152"/>
+            <w:tcW w:type="dxa" w:w="2016"/>
             <w:shd w:val="clear" w:color="auto" w:fill="E7E6E6"/>
           </w:tcPr>
           <w:p>
@@ -3646,7 +3513,7 @@
       <w:tr>
         <w:tc>
           <w:tcPr>
-            <w:tcW w:type="dxa" w:w="3024"/>
+            <w:tcW w:type="dxa" w:w="3312"/>
           </w:tcPr>
           <w:p>
             <w:r/>
@@ -3657,13 +3524,13 @@
                 <w:i w:val="0"/>
                 <w:sz w:val="20"/>
               </w:rPr>
-              <w:t>Total de problemas (Checkstyle)</w:t>
+              <w:t>Total de problemas (Checkstyle, 4 espaços)</w:t>
             </w:r>
           </w:p>
         </w:tc>
         <w:tc>
           <w:tcPr>
-            <w:tcW w:type="dxa" w:w="2736"/>
+            <w:tcW w:type="dxa" w:w="2304"/>
           </w:tcPr>
           <w:p>
             <w:r/>
@@ -3674,13 +3541,13 @@
                 <w:i w:val="0"/>
                 <w:sz w:val="20"/>
               </w:rPr>
-              <w:t>4</w:t>
+              <w:t>5</w:t>
             </w:r>
           </w:p>
         </w:tc>
         <w:tc>
           <w:tcPr>
-            <w:tcW w:type="dxa" w:w="2736"/>
+            <w:tcW w:type="dxa" w:w="2304"/>
           </w:tcPr>
           <w:p>
             <w:r/>
@@ -3697,7 +3564,7 @@
         </w:tc>
         <w:tc>
           <w:tcPr>
-            <w:tcW w:type="dxa" w:w="1152"/>
+            <w:tcW w:type="dxa" w:w="2016"/>
           </w:tcPr>
           <w:p>
             <w:r/>
@@ -3708,7 +3575,7 @@
                 <w:i w:val="0"/>
                 <w:sz w:val="20"/>
               </w:rPr>
-              <w:t>-4 (100%)</w:t>
+              <w:t>100% menos</w:t>
             </w:r>
           </w:p>
         </w:tc>
@@ -3716,7 +3583,7 @@
       <w:tr>
         <w:tc>
           <w:tcPr>
-            <w:tcW w:type="dxa" w:w="3024"/>
+            <w:tcW w:type="dxa" w:w="3312"/>
           </w:tcPr>
           <w:p>
             <w:r/>
@@ -3733,7 +3600,7 @@
         </w:tc>
         <w:tc>
           <w:tcPr>
-            <w:tcW w:type="dxa" w:w="2736"/>
+            <w:tcW w:type="dxa" w:w="2304"/>
           </w:tcPr>
           <w:p>
             <w:r/>
@@ -3750,7 +3617,7 @@
         </w:tc>
         <w:tc>
           <w:tcPr>
-            <w:tcW w:type="dxa" w:w="2736"/>
+            <w:tcW w:type="dxa" w:w="2304"/>
           </w:tcPr>
           <w:p>
             <w:r/>
@@ -3767,7 +3634,7 @@
         </w:tc>
         <w:tc>
           <w:tcPr>
-            <w:tcW w:type="dxa" w:w="1152"/>
+            <w:tcW w:type="dxa" w:w="2016"/>
           </w:tcPr>
           <w:p>
             <w:r/>
@@ -3778,7 +3645,7 @@
                 <w:i w:val="0"/>
                 <w:sz w:val="20"/>
               </w:rPr>
-              <w:t>-1 (100%)</w:t>
+              <w:t>100% menos</w:t>
             </w:r>
           </w:p>
         </w:tc>
@@ -3786,7 +3653,7 @@
       <w:tr>
         <w:tc>
           <w:tcPr>
-            <w:tcW w:type="dxa" w:w="3024"/>
+            <w:tcW w:type="dxa" w:w="3312"/>
           </w:tcPr>
           <w:p>
             <w:r/>
@@ -3803,7 +3670,217 @@
         </w:tc>
         <w:tc>
           <w:tcPr>
-            <w:tcW w:type="dxa" w:w="2736"/>
+            <w:tcW w:type="dxa" w:w="2304"/>
+          </w:tcPr>
+          <w:p>
+            <w:r/>
+            <w:r>
+              <w:rPr>
+                <w:rFonts w:ascii="Calibri" w:hAnsi="Calibri"/>
+                <w:b w:val="0"/>
+                <w:i w:val="0"/>
+                <w:sz w:val="20"/>
+              </w:rPr>
+              <w:t>2</w:t>
+            </w:r>
+          </w:p>
+        </w:tc>
+        <w:tc>
+          <w:tcPr>
+            <w:tcW w:type="dxa" w:w="2304"/>
+          </w:tcPr>
+          <w:p>
+            <w:r/>
+            <w:r>
+              <w:rPr>
+                <w:rFonts w:ascii="Calibri" w:hAnsi="Calibri"/>
+                <w:b w:val="0"/>
+                <w:i w:val="0"/>
+                <w:sz w:val="20"/>
+              </w:rPr>
+              <w:t>0</w:t>
+            </w:r>
+          </w:p>
+        </w:tc>
+        <w:tc>
+          <w:tcPr>
+            <w:tcW w:type="dxa" w:w="2016"/>
+          </w:tcPr>
+          <w:p>
+            <w:r/>
+            <w:r>
+              <w:rPr>
+                <w:rFonts w:ascii="Calibri" w:hAnsi="Calibri"/>
+                <w:b w:val="0"/>
+                <w:i w:val="0"/>
+                <w:sz w:val="20"/>
+              </w:rPr>
+              <w:t>100% menos</w:t>
+            </w:r>
+          </w:p>
+        </w:tc>
+      </w:tr>
+      <w:tr>
+        <w:tc>
+          <w:tcPr>
+            <w:tcW w:type="dxa" w:w="3312"/>
+          </w:tcPr>
+          <w:p>
+            <w:r/>
+            <w:r>
+              <w:rPr>
+                <w:rFonts w:ascii="Calibri" w:hAnsi="Calibri"/>
+                <w:b w:val="0"/>
+                <w:i w:val="0"/>
+                <w:sz w:val="20"/>
+              </w:rPr>
+              <w:t>Complexidade ciclomática máxima</w:t>
+            </w:r>
+          </w:p>
+        </w:tc>
+        <w:tc>
+          <w:tcPr>
+            <w:tcW w:type="dxa" w:w="2304"/>
+          </w:tcPr>
+          <w:p>
+            <w:r/>
+            <w:r>
+              <w:rPr>
+                <w:rFonts w:ascii="Calibri" w:hAnsi="Calibri"/>
+                <w:b w:val="0"/>
+                <w:i w:val="0"/>
+                <w:sz w:val="20"/>
+              </w:rPr>
+              <w:t>9</w:t>
+            </w:r>
+          </w:p>
+        </w:tc>
+        <w:tc>
+          <w:tcPr>
+            <w:tcW w:type="dxa" w:w="2304"/>
+          </w:tcPr>
+          <w:p>
+            <w:r/>
+            <w:r>
+              <w:rPr>
+                <w:rFonts w:ascii="Calibri" w:hAnsi="Calibri"/>
+                <w:b w:val="0"/>
+                <w:i w:val="0"/>
+                <w:sz w:val="20"/>
+              </w:rPr>
+              <w:t>6</w:t>
+            </w:r>
+          </w:p>
+        </w:tc>
+        <w:tc>
+          <w:tcPr>
+            <w:tcW w:type="dxa" w:w="2016"/>
+          </w:tcPr>
+          <w:p>
+            <w:r/>
+            <w:r>
+              <w:rPr>
+                <w:rFonts w:ascii="Calibri" w:hAnsi="Calibri"/>
+                <w:b w:val="0"/>
+                <w:i w:val="0"/>
+                <w:sz w:val="20"/>
+              </w:rPr>
+              <w:t>33% menos</w:t>
+            </w:r>
+          </w:p>
+        </w:tc>
+      </w:tr>
+      <w:tr>
+        <w:tc>
+          <w:tcPr>
+            <w:tcW w:type="dxa" w:w="3312"/>
+          </w:tcPr>
+          <w:p>
+            <w:r/>
+            <w:r>
+              <w:rPr>
+                <w:rFonts w:ascii="Calibri" w:hAnsi="Calibri"/>
+                <w:b w:val="0"/>
+                <w:i w:val="0"/>
+                <w:sz w:val="20"/>
+              </w:rPr>
+              <w:t>Profundidade máxima de if aninhado</w:t>
+            </w:r>
+          </w:p>
+        </w:tc>
+        <w:tc>
+          <w:tcPr>
+            <w:tcW w:type="dxa" w:w="2304"/>
+          </w:tcPr>
+          <w:p>
+            <w:r/>
+            <w:r>
+              <w:rPr>
+                <w:rFonts w:ascii="Calibri" w:hAnsi="Calibri"/>
+                <w:b w:val="0"/>
+                <w:i w:val="0"/>
+                <w:sz w:val="20"/>
+              </w:rPr>
+              <w:t>3</w:t>
+            </w:r>
+          </w:p>
+        </w:tc>
+        <w:tc>
+          <w:tcPr>
+            <w:tcW w:type="dxa" w:w="2304"/>
+          </w:tcPr>
+          <w:p>
+            <w:r/>
+            <w:r>
+              <w:rPr>
+                <w:rFonts w:ascii="Calibri" w:hAnsi="Calibri"/>
+                <w:b w:val="0"/>
+                <w:i w:val="0"/>
+                <w:sz w:val="20"/>
+              </w:rPr>
+              <w:t>0</w:t>
+            </w:r>
+          </w:p>
+        </w:tc>
+        <w:tc>
+          <w:tcPr>
+            <w:tcW w:type="dxa" w:w="2016"/>
+          </w:tcPr>
+          <w:p>
+            <w:r/>
+            <w:r>
+              <w:rPr>
+                <w:rFonts w:ascii="Calibri" w:hAnsi="Calibri"/>
+                <w:b w:val="0"/>
+                <w:i w:val="0"/>
+                <w:sz w:val="20"/>
+              </w:rPr>
+              <w:t>100% menos</w:t>
+            </w:r>
+          </w:p>
+        </w:tc>
+      </w:tr>
+      <w:tr>
+        <w:tc>
+          <w:tcPr>
+            <w:tcW w:type="dxa" w:w="3312"/>
+          </w:tcPr>
+          <w:p>
+            <w:r/>
+            <w:r>
+              <w:rPr>
+                <w:rFonts w:ascii="Calibri" w:hAnsi="Calibri"/>
+                <w:b w:val="0"/>
+                <w:i w:val="0"/>
+                <w:sz w:val="20"/>
+              </w:rPr>
+              <w:t>Comparação de senha String com ==</w:t>
+            </w:r>
+          </w:p>
+        </w:tc>
+        <w:tc>
+          <w:tcPr>
+            <w:tcW w:type="dxa" w:w="2304"/>
           </w:tcPr>
           <w:p>
             <w:r/>
@@ -3820,7 +3897,7 @@
         </w:tc>
         <w:tc>
           <w:tcPr>
-            <w:tcW w:type="dxa" w:w="2736"/>
+            <w:tcW w:type="dxa" w:w="2304"/>
           </w:tcPr>
           <w:p>
             <w:r/>
@@ -3837,7 +3914,7 @@
         </w:tc>
         <w:tc>
           <w:tcPr>
-            <w:tcW w:type="dxa" w:w="1152"/>
+            <w:tcW w:type="dxa" w:w="2016"/>
           </w:tcPr>
           <w:p>
             <w:r/>
@@ -3848,7 +3925,7 @@
                 <w:i w:val="0"/>
                 <w:sz w:val="20"/>
               </w:rPr>
-              <w:t>-1 (100%)</w:t>
+              <w:t>100% menos</w:t>
             </w:r>
           </w:p>
         </w:tc>
@@ -3856,7 +3933,7 @@
       <w:tr>
         <w:tc>
           <w:tcPr>
-            <w:tcW w:type="dxa" w:w="3024"/>
+            <w:tcW w:type="dxa" w:w="3312"/>
           </w:tcPr>
           <w:p>
             <w:r/>
@@ -3867,13 +3944,13 @@
                 <w:i w:val="0"/>
                 <w:sz w:val="20"/>
               </w:rPr>
-              <w:t>Complexidade Ciclomática (máx)</w:t>
+              <w:t>Senha fixa no código (Semgrep)</w:t>
             </w:r>
           </w:p>
         </w:tc>
         <w:tc>
           <w:tcPr>
-            <w:tcW w:type="dxa" w:w="2736"/>
+            <w:tcW w:type="dxa" w:w="2304"/>
           </w:tcPr>
           <w:p>
             <w:r/>
@@ -3884,153 +3961,13 @@
                 <w:i w:val="0"/>
                 <w:sz w:val="20"/>
               </w:rPr>
-              <w:t>~9 (processar)</w:t>
+              <w:t>1</w:t>
             </w:r>
           </w:p>
         </w:tc>
         <w:tc>
           <w:tcPr>
-            <w:tcW w:type="dxa" w:w="2736"/>
-          </w:tcPr>
-          <w:p>
-            <w:r/>
-            <w:r>
-              <w:rPr>
-                <w:rFonts w:ascii="Calibri" w:hAnsi="Calibri"/>
-                <w:b w:val="0"/>
-                <w:i w:val="0"/>
-                <w:sz w:val="20"/>
-              </w:rPr>
-              <w:t>~3 (calcularTaxa)</w:t>
-            </w:r>
-          </w:p>
-        </w:tc>
-        <w:tc>
-          <w:tcPr>
-            <w:tcW w:type="dxa" w:w="1152"/>
-          </w:tcPr>
-          <w:p>
-            <w:r/>
-            <w:r>
-              <w:rPr>
-                <w:rFonts w:ascii="Calibri" w:hAnsi="Calibri"/>
-                <w:b w:val="0"/>
-                <w:i w:val="0"/>
-                <w:sz w:val="20"/>
-              </w:rPr>
-              <w:t>redução de ~70%</w:t>
-            </w:r>
-          </w:p>
-        </w:tc>
-      </w:tr>
-      <w:tr>
-        <w:tc>
-          <w:tcPr>
-            <w:tcW w:type="dxa" w:w="3024"/>
-          </w:tcPr>
-          <w:p>
-            <w:r/>
-            <w:r>
-              <w:rPr>
-                <w:rFonts w:ascii="Calibri" w:hAnsi="Calibri"/>
-                <w:b w:val="0"/>
-                <w:i w:val="0"/>
-                <w:sz w:val="20"/>
-              </w:rPr>
-              <w:t>Profundidade de Aninhamento (máx)</w:t>
-            </w:r>
-          </w:p>
-        </w:tc>
-        <w:tc>
-          <w:tcPr>
-            <w:tcW w:type="dxa" w:w="2736"/>
-          </w:tcPr>
-          <w:p>
-            <w:r/>
-            <w:r>
-              <w:rPr>
-                <w:rFonts w:ascii="Calibri" w:hAnsi="Calibri"/>
-                <w:b w:val="0"/>
-                <w:i w:val="0"/>
-                <w:sz w:val="20"/>
-              </w:rPr>
-              <w:t>4 níveis</w:t>
-            </w:r>
-          </w:p>
-        </w:tc>
-        <w:tc>
-          <w:tcPr>
-            <w:tcW w:type="dxa" w:w="2736"/>
-          </w:tcPr>
-          <w:p>
-            <w:r/>
-            <w:r>
-              <w:rPr>
-                <w:rFonts w:ascii="Calibri" w:hAnsi="Calibri"/>
-                <w:b w:val="0"/>
-                <w:i w:val="0"/>
-                <w:sz w:val="20"/>
-              </w:rPr>
-              <w:t>1 nível</w:t>
-            </w:r>
-          </w:p>
-        </w:tc>
-        <w:tc>
-          <w:tcPr>
-            <w:tcW w:type="dxa" w:w="1152"/>
-          </w:tcPr>
-          <w:p>
-            <w:r/>
-            <w:r>
-              <w:rPr>
-                <w:rFonts w:ascii="Calibri" w:hAnsi="Calibri"/>
-                <w:b w:val="0"/>
-                <w:i w:val="0"/>
-                <w:sz w:val="20"/>
-              </w:rPr>
-              <w:t>-3 níveis</w:t>
-            </w:r>
-          </w:p>
-        </w:tc>
-      </w:tr>
-      <w:tr>
-        <w:tc>
-          <w:tcPr>
-            <w:tcW w:type="dxa" w:w="3024"/>
-          </w:tcPr>
-          <w:p>
-            <w:r/>
-            <w:r>
-              <w:rPr>
-                <w:rFonts w:ascii="Calibri" w:hAnsi="Calibri"/>
-                <w:b w:val="0"/>
-                <w:i w:val="0"/>
-                <w:sz w:val="20"/>
-              </w:rPr>
-              <w:t>Uso de == para Strings</w:t>
-            </w:r>
-          </w:p>
-        </w:tc>
-        <w:tc>
-          <w:tcPr>
-            <w:tcW w:type="dxa" w:w="2736"/>
-          </w:tcPr>
-          <w:p>
-            <w:r/>
-            <w:r>
-              <w:rPr>
-                <w:rFonts w:ascii="Calibri" w:hAnsi="Calibri"/>
-                <w:b w:val="0"/>
-                <w:i w:val="0"/>
-                <w:sz w:val="20"/>
-              </w:rPr>
-              <w:t>1 ocorrência</w:t>
-            </w:r>
-          </w:p>
-        </w:tc>
-        <w:tc>
-          <w:tcPr>
-            <w:tcW w:type="dxa" w:w="2736"/>
+            <w:tcW w:type="dxa" w:w="2304"/>
           </w:tcPr>
           <w:p>
             <w:r/>
@@ -4047,7 +3984,7 @@
         </w:tc>
         <w:tc>
           <w:tcPr>
-            <w:tcW w:type="dxa" w:w="1152"/>
+            <w:tcW w:type="dxa" w:w="2016"/>
           </w:tcPr>
           <w:p>
             <w:r/>
@@ -4058,7 +3995,7 @@
                 <w:i w:val="0"/>
                 <w:sz w:val="20"/>
               </w:rPr>
-              <w:t>-1</w:t>
+              <w:t>100% menos</w:t>
             </w:r>
           </w:p>
         </w:tc>
@@ -4066,7 +4003,7 @@
       <w:tr>
         <w:tc>
           <w:tcPr>
-            <w:tcW w:type="dxa" w:w="3024"/>
+            <w:tcW w:type="dxa" w:w="3312"/>
           </w:tcPr>
           <w:p>
             <w:r/>
@@ -4077,13 +4014,13 @@
                 <w:i w:val="0"/>
                 <w:sz w:val="20"/>
               </w:rPr>
-              <w:t>Senhas Hardcoded</w:t>
+              <w:t>Números mágicos (Checkstyle dedicado)</w:t>
             </w:r>
           </w:p>
         </w:tc>
         <w:tc>
           <w:tcPr>
-            <w:tcW w:type="dxa" w:w="2736"/>
+            <w:tcW w:type="dxa" w:w="2304"/>
           </w:tcPr>
           <w:p>
             <w:r/>
@@ -4094,13 +4031,13 @@
                 <w:i w:val="0"/>
                 <w:sz w:val="20"/>
               </w:rPr>
-              <w:t>1 (comparação direta em texto puro)</w:t>
+              <w:t>9</w:t>
             </w:r>
           </w:p>
         </w:tc>
         <w:tc>
           <w:tcPr>
-            <w:tcW w:type="dxa" w:w="2736"/>
+            <w:tcW w:type="dxa" w:w="2304"/>
           </w:tcPr>
           <w:p>
             <w:r/>
@@ -4111,13 +4048,13 @@
                 <w:i w:val="0"/>
                 <w:sz w:val="20"/>
               </w:rPr>
-              <w:t>0 (validação por hash SHA-256)</w:t>
+              <w:t>0</w:t>
             </w:r>
           </w:p>
         </w:tc>
         <w:tc>
           <w:tcPr>
-            <w:tcW w:type="dxa" w:w="1152"/>
+            <w:tcW w:type="dxa" w:w="2016"/>
           </w:tcPr>
           <w:p>
             <w:r/>
@@ -4128,77 +4065,7 @@
                 <w:i w:val="0"/>
                 <w:sz w:val="20"/>
               </w:rPr>
-              <w:t>eliminado</w:t>
-            </w:r>
-          </w:p>
-        </w:tc>
-      </w:tr>
-      <w:tr>
-        <w:tc>
-          <w:tcPr>
-            <w:tcW w:type="dxa" w:w="3024"/>
-          </w:tcPr>
-          <w:p>
-            <w:r/>
-            <w:r>
-              <w:rPr>
-                <w:rFonts w:ascii="Calibri" w:hAnsi="Calibri"/>
-                <w:b w:val="0"/>
-                <w:i w:val="0"/>
-                <w:sz w:val="20"/>
-              </w:rPr>
-              <w:t>Constantes Mágicas</w:t>
-            </w:r>
-          </w:p>
-        </w:tc>
-        <w:tc>
-          <w:tcPr>
-            <w:tcW w:type="dxa" w:w="2736"/>
-          </w:tcPr>
-          <w:p>
-            <w:r/>
-            <w:r>
-              <w:rPr>
-                <w:rFonts w:ascii="Calibri" w:hAnsi="Calibri"/>
-                <w:b w:val="0"/>
-                <w:i w:val="0"/>
-                <w:sz w:val="20"/>
-              </w:rPr>
-              <w:t>6 (0.05, 0.02, 16, 10, 50, 100)</w:t>
-            </w:r>
-          </w:p>
-        </w:tc>
-        <w:tc>
-          <w:tcPr>
-            <w:tcW w:type="dxa" w:w="2736"/>
-          </w:tcPr>
-          <w:p>
-            <w:r/>
-            <w:r>
-              <w:rPr>
-                <w:rFonts w:ascii="Calibri" w:hAnsi="Calibri"/>
-                <w:b w:val="0"/>
-                <w:i w:val="0"/>
-                <w:sz w:val="20"/>
-              </w:rPr>
-              <w:t>0 (todas nomeadas)</w:t>
-            </w:r>
-          </w:p>
-        </w:tc>
-        <w:tc>
-          <w:tcPr>
-            <w:tcW w:type="dxa" w:w="1152"/>
-          </w:tcPr>
-          <w:p>
-            <w:r/>
-            <w:r>
-              <w:rPr>
-                <w:rFonts w:ascii="Calibri" w:hAnsi="Calibri"/>
-                <w:b w:val="0"/>
-                <w:i w:val="0"/>
-                <w:sz w:val="20"/>
-              </w:rPr>
-              <w:t>-6</w:t>
+              <w:t>100% menos</w:t>
             </w:r>
           </w:p>
         </w:tc>
@@ -4220,7 +4087,7 @@
           <w:i/>
           <w:sz w:val="21"/>
         </w:rPr>
-        <w:t>Observação: a string "admin123" ainda aparece uma vez no código (como valor de referência pra gerar o hash), mas deixou de ser comparada diretamente com a senha informada pelo usuário — a comparação passa a ser feita entre hashes, o que já elimina o risco principal de exposição da senha em texto puro.</w:t>
+        <w:t>Regra de contagem: o Checkstyle principal foi medido com as regras Google e indentação ajustada para 4 espaços, como pede a atividade. O padrão de 2 espaços do Google foi executado à parte e registrado em XML; como a exigência de indentação conflita com esse perfil padrão, a contagem padrão não é usada na comparação principal.</w:t>
       </w:r>
     </w:p>
     <w:p>
@@ -4234,7 +4101,119 @@
           <w:i w:val="0"/>
           <w:sz w:val="23"/>
         </w:rPr>
-        <w:t>6. Pendências de entrega</w:t>
+        <w:t>6. Validação funcional</w:t>
+      </w:r>
+    </w:p>
+    <w:p>
+      <w:pPr>
+        <w:spacing w:after="120"/>
+      </w:pPr>
+      <w:r>
+        <w:rPr>
+          <w:rFonts w:ascii="Calibri" w:hAnsi="Calibri"/>
+          <w:b w:val="0"/>
+          <w:i w:val="0"/>
+          <w:sz w:val="21"/>
+        </w:rPr>
+        <w:t>APROVADO: 230 verificações. Foram comparadas 168 combinações de pagamentos e 40 combinações de descontos com a versão original, além de 10 limites de cartão, quatro entradas de senha e cinco configurações inválidas. Nenhuma senha de teste foi gravada em arquivo.</w:t>
+      </w:r>
+    </w:p>
+    <w:p>
+      <w:pPr>
+        <w:spacing w:before="200" w:after="80"/>
+      </w:pPr>
+      <w:r>
+        <w:rPr>
+          <w:rFonts w:ascii="Calibri" w:hAnsi="Calibri"/>
+          <w:b/>
+          <w:i w:val="0"/>
+          <w:sz w:val="23"/>
+        </w:rPr>
+        <w:t>7. Decisão de segurança</w:t>
+      </w:r>
+    </w:p>
+    <w:p>
+      <w:pPr>
+        <w:spacing w:after="120"/>
+      </w:pPr>
+      <w:r>
+        <w:rPr>
+          <w:rFonts w:ascii="Calibri" w:hAnsi="Calibri"/>
+          <w:b w:val="0"/>
+          <w:i w:val="0"/>
+          <w:sz w:val="21"/>
+        </w:rPr>
+        <w:t>A refatoração não substitui a senha fixa por outro segredo codificado. O cadastro deve fornecer hash PBKDF2-HMAC-SHA256 e salt aleatório em Base64. A verificação usa 600.000 iterações, 256 bits e comparação resistente a diferenças de tempo (timing attack), conforme a OWASP Password Storage Cheat Sheet. Em produção, o cadastro e o armazenamento precisam se integrar a um serviço de credenciais seguro.</w:t>
+      </w:r>
+    </w:p>
+    <w:p>
+      <w:pPr>
+        <w:spacing w:before="200" w:after="80"/>
+      </w:pPr>
+      <w:r>
+        <w:rPr>
+          <w:rFonts w:ascii="Calibri" w:hAnsi="Calibri"/>
+          <w:b/>
+          <w:i w:val="0"/>
+          <w:sz w:val="23"/>
+        </w:rPr>
+        <w:t>8. Decisão de compatibilidade</w:t>
+      </w:r>
+    </w:p>
+    <w:p>
+      <w:pPr>
+        <w:spacing w:after="120"/>
+      </w:pPr>
+      <w:r>
+        <w:rPr>
+          <w:rFonts w:ascii="Calibri" w:hAnsi="Calibri"/>
+          <w:b w:val="0"/>
+          <w:i w:val="0"/>
+          <w:sz w:val="21"/>
+        </w:rPr>
+        <w:t>O código conserva a regra original de exigir cartão com 16 caracteres inclusive para PIX, para permitir a comparação comportamento a comportamento. O Javadoc identifica isso como limitação didática. O dinheiro continua sendo double porque essa é a interface proposta no exercício.</w:t>
+      </w:r>
+    </w:p>
+    <w:p>
+      <w:pPr>
+        <w:spacing w:before="200" w:after="80"/>
+      </w:pPr>
+      <w:r>
+        <w:rPr>
+          <w:rFonts w:ascii="Calibri" w:hAnsi="Calibri"/>
+          <w:b/>
+          <w:i w:val="0"/>
+          <w:sz w:val="23"/>
+        </w:rPr>
+        <w:t>9. Ferramentas e evidências</w:t>
+      </w:r>
+    </w:p>
+    <w:p>
+      <w:pPr>
+        <w:spacing w:after="120"/>
+      </w:pPr>
+      <w:r>
+        <w:rPr>
+          <w:rFonts w:ascii="Calibri" w:hAnsi="Calibri"/>
+          <w:b w:val="0"/>
+          <w:i w:val="0"/>
+          <w:sz w:val="21"/>
+        </w:rPr>
+        <w:t>Checkstyle 9.3 (mesmo jar da extensão VS Code), SpotBugs 4.10.4 e Semgrep 1.179.0 com duas regras locais incluídas no projeto. Os resultados completos (XML/JSON, logs, código original compilado e o refatorado) estão nas pastas do projeto.</w:t>
+      </w:r>
+    </w:p>
+    <w:p>
+      <w:pPr>
+        <w:spacing w:before="200" w:after="80"/>
+      </w:pPr>
+      <w:r>
+        <w:rPr>
+          <w:rFonts w:ascii="Calibri" w:hAnsi="Calibri"/>
+          <w:b/>
+          <w:i w:val="0"/>
+          <w:sz w:val="23"/>
+        </w:rPr>
+        <w:t>10. Pendências de entrega</w:t>
       </w:r>
     </w:p>
     <w:p>
@@ -4278,7 +4257,7 @@
           <w:i/>
           <w:sz w:val="21"/>
         </w:rPr>
-        <w:t>Esses dois prints precisam ser capturados rodando o VS Code com as extensões instaladas (Checkstyle, SpotBugs, Semgrep, SonarLint) — não é possível gerá-los sem executar o ambiente real localmente.</w:t>
+        <w:t>Esses dois prints precisam ser capturados rodando o VS Code com as extensões instaladas (Checkstyle, SpotBugs, Semgrep) — não é possível gerá-los sem executar o ambiente real localmente.</w:t>
       </w:r>
     </w:p>
     <w:sectPr>

</xml_diff>

<commit_message>
Adiciona código real (PBKDF2) e projeto completo de evidências da AT11
Substitui o placeholder de validarSenha() pelo código-fonte literal
com PBKDF2-HMAC-SHA256, salt e comparação resistente a timing attack.
Adiciona o projeto completo (antes/depois, configs do Checkstyle e
Semgrep, resultados XML/JSON de cada ferramenta, suíte de 230 testes
de regressão) em atividade-11/projeto/, com todos os números
conferidos contra as saídas reais das ferramentas.

Co-Authored-By: Claude Sonnet 5 <noreply@anthropic.com>
Claude-Session: https://claude.ai/code/session_018BLEsdhLyv9pz4Sfwa1pJ4
</commit_message>
<xml_diff>
--- a/garantia-qualidade-software/atividade-11/Atividade11_Analise_Estatica_Refatoracao.docx
+++ b/garantia-qualidade-software/atividade-11/Atividade11_Analise_Estatica_Refatoracao.docx
@@ -204,7 +204,7 @@
           <w:color w:val="1F1F1F"/>
           <w:sz w:val="18"/>
         </w:rPr>
-        <w:t>package src;</w:t>
+        <w:t>package src;</w:t>
         <w:br/>
       </w:r>
       <w:r>
@@ -225,7 +225,7 @@
           <w:color w:val="1F1F1F"/>
           <w:sz w:val="18"/>
         </w:rPr>
-        <w:t>import java.util.*;</w:t>
+        <w:t>import java.util.*;</w:t>
         <w:br/>
       </w:r>
       <w:r>
@@ -246,7 +246,7 @@
           <w:color w:val="1F1F1F"/>
           <w:sz w:val="18"/>
         </w:rPr>
-        <w:t>public class ProcessadorPagamento {</w:t>
+        <w:t>public class ProcessadorPagamento {</w:t>
         <w:br/>
       </w:r>
       <w:r>
@@ -267,7 +267,7 @@
           <w:color w:val="1F1F1F"/>
           <w:sz w:val="18"/>
         </w:rPr>
-        <w:t xml:space="preserve">  public void processar(String tipo, double valor, String cartao) {</w:t>
+        <w:t xml:space="preserve">    public void processar(String tipo, double valor, String cartao) {</w:t>
         <w:br/>
       </w:r>
       <w:r>
@@ -288,7 +288,7 @@
           <w:color w:val="1F1F1F"/>
           <w:sz w:val="18"/>
         </w:rPr>
-        <w:t xml:space="preserve">    if (tipo != null &amp;&amp; !tipo.isEmpty()) {</w:t>
+        <w:t xml:space="preserve">        if (tipo != null &amp;&amp; !tipo.isEmpty()) {</w:t>
         <w:br/>
       </w:r>
       <w:r>
@@ -299,7 +299,7 @@
           <w:color w:val="1F1F1F"/>
           <w:sz w:val="18"/>
         </w:rPr>
-        <w:t xml:space="preserve">      if (valor &gt; 0) {</w:t>
+        <w:t xml:space="preserve">            if (valor &gt; 0) {</w:t>
         <w:br/>
       </w:r>
       <w:r>
@@ -310,7 +310,7 @@
           <w:color w:val="1F1F1F"/>
           <w:sz w:val="18"/>
         </w:rPr>
-        <w:t xml:space="preserve">        if (cartao != null &amp;&amp; cartao.length() == 16) {</w:t>
+        <w:t xml:space="preserve">                if (cartao != null &amp;&amp; cartao.length() == 16) {</w:t>
         <w:br/>
       </w:r>
       <w:r>
@@ -331,7 +331,7 @@
           <w:color w:val="1F1F1F"/>
           <w:sz w:val="18"/>
         </w:rPr>
-        <w:t xml:space="preserve">          if (tipo.equals("credito")) {</w:t>
+        <w:t xml:space="preserve">                    if (tipo.equals("credito")) {</w:t>
         <w:br/>
       </w:r>
       <w:r>
@@ -342,7 +342,7 @@
           <w:color w:val="1F1F1F"/>
           <w:sz w:val="18"/>
         </w:rPr>
-        <w:t xml:space="preserve">            System.out.println("Processando crédito de R$ " + valor);</w:t>
+        <w:t xml:space="preserve">                        System.out.println("Processando crédito de R$ " + valor);</w:t>
         <w:br/>
       </w:r>
       <w:r>
@@ -353,7 +353,7 @@
           <w:color w:val="1F1F1F"/>
           <w:sz w:val="18"/>
         </w:rPr>
-        <w:t xml:space="preserve">            double taxa = valor * 0.05;</w:t>
+        <w:t xml:space="preserve">                        double taxa = valor * 0.05;</w:t>
         <w:br/>
       </w:r>
       <w:r>
@@ -364,7 +364,7 @@
           <w:color w:val="1F1F1F"/>
           <w:sz w:val="18"/>
         </w:rPr>
-        <w:t xml:space="preserve">            double total = valor + taxa;</w:t>
+        <w:t xml:space="preserve">                        double total = valor + taxa;</w:t>
         <w:br/>
       </w:r>
       <w:r>
@@ -375,7 +375,7 @@
           <w:color w:val="1F1F1F"/>
           <w:sz w:val="18"/>
         </w:rPr>
-        <w:t xml:space="preserve">            System.out.println("Total com taxa: R$ " + total);</w:t>
+        <w:t xml:space="preserve">                        System.out.println("Total com taxa: R$ " + total);</w:t>
         <w:br/>
       </w:r>
       <w:r>
@@ -386,7 +386,7 @@
           <w:color w:val="1F1F1F"/>
           <w:sz w:val="18"/>
         </w:rPr>
-        <w:t xml:space="preserve">          } else if (tipo.equals("debito")) {</w:t>
+        <w:t xml:space="preserve">                    } else if (tipo.equals("debito")) {</w:t>
         <w:br/>
       </w:r>
       <w:r>
@@ -397,7 +397,7 @@
           <w:color w:val="1F1F1F"/>
           <w:sz w:val="18"/>
         </w:rPr>
-        <w:t xml:space="preserve">            System.out.println("Processando débito de R$ " + valor);</w:t>
+        <w:t xml:space="preserve">                        System.out.println("Processando débito de R$ " + valor);</w:t>
         <w:br/>
       </w:r>
       <w:r>
@@ -408,7 +408,7 @@
           <w:color w:val="1F1F1F"/>
           <w:sz w:val="18"/>
         </w:rPr>
-        <w:t xml:space="preserve">            double taxa = valor * 0.02;</w:t>
+        <w:t xml:space="preserve">                        double taxa = valor * 0.02;</w:t>
         <w:br/>
       </w:r>
       <w:r>
@@ -419,7 +419,7 @@
           <w:color w:val="1F1F1F"/>
           <w:sz w:val="18"/>
         </w:rPr>
-        <w:t xml:space="preserve">            double total = valor + taxa;</w:t>
+        <w:t xml:space="preserve">                        double total = valor + taxa;</w:t>
         <w:br/>
       </w:r>
       <w:r>
@@ -430,7 +430,7 @@
           <w:color w:val="1F1F1F"/>
           <w:sz w:val="18"/>
         </w:rPr>
-        <w:t xml:space="preserve">            System.out.println("Total com taxa: R$ " + total);</w:t>
+        <w:t xml:space="preserve">                        System.out.println("Total com taxa: R$ " + total);</w:t>
         <w:br/>
       </w:r>
       <w:r>
@@ -441,7 +441,7 @@
           <w:color w:val="1F1F1F"/>
           <w:sz w:val="18"/>
         </w:rPr>
-        <w:t xml:space="preserve">          } else if (tipo.equals("pix")) {</w:t>
+        <w:t xml:space="preserve">                    } else if (tipo.equals("pix")) {</w:t>
         <w:br/>
       </w:r>
       <w:r>
@@ -452,7 +452,7 @@
           <w:color w:val="1F1F1F"/>
           <w:sz w:val="18"/>
         </w:rPr>
-        <w:t xml:space="preserve">            System.out.println("Processando PIX de R$ " + valor);</w:t>
+        <w:t xml:space="preserve">                        System.out.println("Processando PIX de R$ " + valor);</w:t>
         <w:br/>
       </w:r>
       <w:r>
@@ -463,7 +463,7 @@
           <w:color w:val="1F1F1F"/>
           <w:sz w:val="18"/>
         </w:rPr>
-        <w:t xml:space="preserve">          } else {</w:t>
+        <w:t xml:space="preserve">                    } else {</w:t>
         <w:br/>
       </w:r>
       <w:r>
@@ -474,7 +474,7 @@
           <w:color w:val="1F1F1F"/>
           <w:sz w:val="18"/>
         </w:rPr>
-        <w:t xml:space="preserve">            System.out.println("Tipo inválido");</w:t>
+        <w:t xml:space="preserve">                        System.out.println("Tipo inválido");</w:t>
         <w:br/>
       </w:r>
       <w:r>
@@ -485,7 +485,7 @@
           <w:color w:val="1F1F1F"/>
           <w:sz w:val="18"/>
         </w:rPr>
-        <w:t xml:space="preserve">          }</w:t>
+        <w:t xml:space="preserve">                    }</w:t>
         <w:br/>
       </w:r>
       <w:r>
@@ -506,7 +506,7 @@
           <w:color w:val="1F1F1F"/>
           <w:sz w:val="18"/>
         </w:rPr>
-        <w:t xml:space="preserve">        } else {</w:t>
+        <w:t xml:space="preserve">                } else {</w:t>
         <w:br/>
       </w:r>
       <w:r>
@@ -517,7 +517,73 @@
           <w:color w:val="1F1F1F"/>
           <w:sz w:val="18"/>
         </w:rPr>
-        <w:t xml:space="preserve">          System.out.println("Cartão inválido");</w:t>
+        <w:t xml:space="preserve">                    System.out.println("Cartão inválido");</w:t>
+        <w:br/>
+      </w:r>
+      <w:r>
+        <w:rPr>
+          <w:rFonts w:ascii="Consolas" w:hAnsi="Consolas"/>
+          <w:b w:val="0"/>
+          <w:i w:val="0"/>
+          <w:color w:val="1F1F1F"/>
+          <w:sz w:val="18"/>
+        </w:rPr>
+        <w:t xml:space="preserve">                }</w:t>
+        <w:br/>
+      </w:r>
+      <w:r>
+        <w:rPr>
+          <w:rFonts w:ascii="Consolas" w:hAnsi="Consolas"/>
+          <w:b w:val="0"/>
+          <w:i w:val="0"/>
+          <w:color w:val="1F1F1F"/>
+          <w:sz w:val="18"/>
+        </w:rPr>
+        <w:t xml:space="preserve">            } else {</w:t>
+        <w:br/>
+      </w:r>
+      <w:r>
+        <w:rPr>
+          <w:rFonts w:ascii="Consolas" w:hAnsi="Consolas"/>
+          <w:b w:val="0"/>
+          <w:i w:val="0"/>
+          <w:color w:val="1F1F1F"/>
+          <w:sz w:val="18"/>
+        </w:rPr>
+        <w:t xml:space="preserve">                System.out.println("Valor inválido");</w:t>
+        <w:br/>
+      </w:r>
+      <w:r>
+        <w:rPr>
+          <w:rFonts w:ascii="Consolas" w:hAnsi="Consolas"/>
+          <w:b w:val="0"/>
+          <w:i w:val="0"/>
+          <w:color w:val="1F1F1F"/>
+          <w:sz w:val="18"/>
+        </w:rPr>
+        <w:t xml:space="preserve">            }</w:t>
+        <w:br/>
+      </w:r>
+      <w:r>
+        <w:rPr>
+          <w:rFonts w:ascii="Consolas" w:hAnsi="Consolas"/>
+          <w:b w:val="0"/>
+          <w:i w:val="0"/>
+          <w:color w:val="1F1F1F"/>
+          <w:sz w:val="18"/>
+        </w:rPr>
+        <w:t xml:space="preserve">        } else {</w:t>
+        <w:br/>
+      </w:r>
+      <w:r>
+        <w:rPr>
+          <w:rFonts w:ascii="Consolas" w:hAnsi="Consolas"/>
+          <w:b w:val="0"/>
+          <w:i w:val="0"/>
+          <w:color w:val="1F1F1F"/>
+          <w:sz w:val="18"/>
+        </w:rPr>
+        <w:t xml:space="preserve">            System.out.println("Tipo inválido");</w:t>
         <w:br/>
       </w:r>
       <w:r>
@@ -539,7 +605,7 @@
           <w:color w:val="1F1F1F"/>
           <w:sz w:val="18"/>
         </w:rPr>
-        <w:t xml:space="preserve">      } else {</w:t>
+        <w:t xml:space="preserve">    }</w:t>
         <w:br/>
       </w:r>
       <w:r>
@@ -550,7 +616,6 @@
           <w:color w:val="1F1F1F"/>
           <w:sz w:val="18"/>
         </w:rPr>
-        <w:t xml:space="preserve">        System.out.println("Valor inválido");</w:t>
         <w:br/>
       </w:r>
       <w:r>
@@ -561,7 +626,7 @@
           <w:color w:val="1F1F1F"/>
           <w:sz w:val="18"/>
         </w:rPr>
-        <w:t xml:space="preserve">      }</w:t>
+        <w:t xml:space="preserve">    public boolean validarSenha(String senha) {</w:t>
         <w:br/>
       </w:r>
       <w:r>
@@ -572,7 +637,7 @@
           <w:color w:val="1F1F1F"/>
           <w:sz w:val="18"/>
         </w:rPr>
-        <w:t xml:space="preserve">    } else {</w:t>
+        <w:t xml:space="preserve">        String senhaCorreta = "admin123";</w:t>
         <w:br/>
       </w:r>
       <w:r>
@@ -583,7 +648,50 @@
           <w:color w:val="1F1F1F"/>
           <w:sz w:val="18"/>
         </w:rPr>
-        <w:t xml:space="preserve">      System.out.println("Tipo inválido");</w:t>
+        <w:t xml:space="preserve">        if (senha == senhaCorreta) {</w:t>
+        <w:br/>
+      </w:r>
+      <w:r>
+        <w:rPr>
+          <w:rFonts w:ascii="Consolas" w:hAnsi="Consolas"/>
+          <w:b w:val="0"/>
+          <w:i w:val="0"/>
+          <w:color w:val="1F1F1F"/>
+          <w:sz w:val="18"/>
+        </w:rPr>
+        <w:t xml:space="preserve">            return true;</w:t>
+        <w:br/>
+      </w:r>
+      <w:r>
+        <w:rPr>
+          <w:rFonts w:ascii="Consolas" w:hAnsi="Consolas"/>
+          <w:b w:val="0"/>
+          <w:i w:val="0"/>
+          <w:color w:val="1F1F1F"/>
+          <w:sz w:val="18"/>
+        </w:rPr>
+        <w:t xml:space="preserve">        }</w:t>
+        <w:br/>
+      </w:r>
+      <w:r>
+        <w:rPr>
+          <w:rFonts w:ascii="Consolas" w:hAnsi="Consolas"/>
+          <w:b w:val="0"/>
+          <w:i w:val="0"/>
+          <w:color w:val="1F1F1F"/>
+          <w:sz w:val="18"/>
+        </w:rPr>
+        <w:br/>
+      </w:r>
+      <w:r>
+        <w:rPr>
+          <w:rFonts w:ascii="Consolas" w:hAnsi="Consolas"/>
+          <w:b w:val="0"/>
+          <w:i w:val="0"/>
+          <w:color w:val="1F1F1F"/>
+          <w:sz w:val="18"/>
+        </w:rPr>
+        <w:t xml:space="preserve">        return false;</w:t>
         <w:br/>
       </w:r>
       <w:r>
@@ -605,7 +713,6 @@
           <w:color w:val="1F1F1F"/>
           <w:sz w:val="18"/>
         </w:rPr>
-        <w:t xml:space="preserve">  }</w:t>
         <w:br/>
       </w:r>
       <w:r>
@@ -616,6 +723,7 @@
           <w:color w:val="1F1F1F"/>
           <w:sz w:val="18"/>
         </w:rPr>
+        <w:t xml:space="preserve">    public double calcularDesconto(int quantidade, double preco) {</w:t>
         <w:br/>
       </w:r>
       <w:r>
@@ -626,7 +734,7 @@
           <w:color w:val="1F1F1F"/>
           <w:sz w:val="18"/>
         </w:rPr>
-        <w:t xml:space="preserve">  public boolean validarSenha(String senha) {</w:t>
+        <w:t xml:space="preserve">        if (quantidade &gt; 0) {</w:t>
         <w:br/>
       </w:r>
       <w:r>
@@ -637,7 +745,7 @@
           <w:color w:val="1F1F1F"/>
           <w:sz w:val="18"/>
         </w:rPr>
-        <w:t xml:space="preserve">    String senhaCorreta = "admin123";</w:t>
+        <w:t xml:space="preserve">            if (quantidade &gt;= 10) {</w:t>
         <w:br/>
       </w:r>
       <w:r>
@@ -648,7 +756,7 @@
           <w:color w:val="1F1F1F"/>
           <w:sz w:val="18"/>
         </w:rPr>
-        <w:t xml:space="preserve">    if (senha == senhaCorreta) {</w:t>
+        <w:t xml:space="preserve">                if (quantidade &gt;= 50) {</w:t>
         <w:br/>
       </w:r>
       <w:r>
@@ -659,7 +767,7 @@
           <w:color w:val="1F1F1F"/>
           <w:sz w:val="18"/>
         </w:rPr>
-        <w:t xml:space="preserve">      return true;</w:t>
+        <w:t xml:space="preserve">                    if (quantidade &gt;= 100) {</w:t>
         <w:br/>
       </w:r>
       <w:r>
@@ -670,7 +778,7 @@
           <w:color w:val="1F1F1F"/>
           <w:sz w:val="18"/>
         </w:rPr>
-        <w:t xml:space="preserve">    }</w:t>
+        <w:t xml:space="preserve">                        return preco * quantidade * 0.7;</w:t>
         <w:br/>
       </w:r>
       <w:r>
@@ -681,7 +789,7 @@
           <w:color w:val="1F1F1F"/>
           <w:sz w:val="18"/>
         </w:rPr>
-        <w:t xml:space="preserve">    return false;</w:t>
+        <w:t xml:space="preserve">                    } else {</w:t>
         <w:br/>
       </w:r>
       <w:r>
@@ -692,7 +800,7 @@
           <w:color w:val="1F1F1F"/>
           <w:sz w:val="18"/>
         </w:rPr>
-        <w:t xml:space="preserve">  }</w:t>
+        <w:t xml:space="preserve">                        return preco * quantidade * 0.8;</w:t>
         <w:br/>
       </w:r>
       <w:r>
@@ -703,6 +811,7 @@
           <w:color w:val="1F1F1F"/>
           <w:sz w:val="18"/>
         </w:rPr>
+        <w:t xml:space="preserve">                    }</w:t>
         <w:br/>
       </w:r>
       <w:r>
@@ -713,7 +822,7 @@
           <w:color w:val="1F1F1F"/>
           <w:sz w:val="18"/>
         </w:rPr>
-        <w:t xml:space="preserve">  public double calcularDesconto(int quantidade, double preco) {</w:t>
+        <w:t xml:space="preserve">                } else {</w:t>
         <w:br/>
       </w:r>
       <w:r>
@@ -724,7 +833,7 @@
           <w:color w:val="1F1F1F"/>
           <w:sz w:val="18"/>
         </w:rPr>
-        <w:t xml:space="preserve">    if (quantidade &gt; 0) {</w:t>
+        <w:t xml:space="preserve">                    return preco * quantidade * 0.9;</w:t>
         <w:br/>
       </w:r>
       <w:r>
@@ -735,7 +844,7 @@
           <w:color w:val="1F1F1F"/>
           <w:sz w:val="18"/>
         </w:rPr>
-        <w:t xml:space="preserve">      if (quantidade &gt;= 10) {</w:t>
+        <w:t xml:space="preserve">                }</w:t>
         <w:br/>
       </w:r>
       <w:r>
@@ -746,7 +855,7 @@
           <w:color w:val="1F1F1F"/>
           <w:sz w:val="18"/>
         </w:rPr>
-        <w:t xml:space="preserve">        if (quantidade &gt;= 50) {</w:t>
+        <w:t xml:space="preserve">            } else {</w:t>
         <w:br/>
       </w:r>
       <w:r>
@@ -757,7 +866,7 @@
           <w:color w:val="1F1F1F"/>
           <w:sz w:val="18"/>
         </w:rPr>
-        <w:t xml:space="preserve">          if (quantidade &gt;= 100) {</w:t>
+        <w:t xml:space="preserve">                return preco * quantidade;</w:t>
         <w:br/>
       </w:r>
       <w:r>
@@ -768,7 +877,7 @@
           <w:color w:val="1F1F1F"/>
           <w:sz w:val="18"/>
         </w:rPr>
-        <w:t xml:space="preserve">            return preco * quantidade * 0.7;</w:t>
+        <w:t xml:space="preserve">            }</w:t>
         <w:br/>
       </w:r>
       <w:r>
@@ -779,7 +888,7 @@
           <w:color w:val="1F1F1F"/>
           <w:sz w:val="18"/>
         </w:rPr>
-        <w:t xml:space="preserve">          } else {</w:t>
+        <w:t xml:space="preserve">        } else {</w:t>
         <w:br/>
       </w:r>
       <w:r>
@@ -790,40 +899,7 @@
           <w:color w:val="1F1F1F"/>
           <w:sz w:val="18"/>
         </w:rPr>
-        <w:t xml:space="preserve">            return preco * quantidade * 0.8;</w:t>
-        <w:br/>
-      </w:r>
-      <w:r>
-        <w:rPr>
-          <w:rFonts w:ascii="Consolas" w:hAnsi="Consolas"/>
-          <w:b w:val="0"/>
-          <w:i w:val="0"/>
-          <w:color w:val="1F1F1F"/>
-          <w:sz w:val="18"/>
-        </w:rPr>
-        <w:t xml:space="preserve">          }</w:t>
-        <w:br/>
-      </w:r>
-      <w:r>
-        <w:rPr>
-          <w:rFonts w:ascii="Consolas" w:hAnsi="Consolas"/>
-          <w:b w:val="0"/>
-          <w:i w:val="0"/>
-          <w:color w:val="1F1F1F"/>
-          <w:sz w:val="18"/>
-        </w:rPr>
-        <w:t xml:space="preserve">        } else {</w:t>
-        <w:br/>
-      </w:r>
-      <w:r>
-        <w:rPr>
-          <w:rFonts w:ascii="Consolas" w:hAnsi="Consolas"/>
-          <w:b w:val="0"/>
-          <w:i w:val="0"/>
-          <w:color w:val="1F1F1F"/>
-          <w:sz w:val="18"/>
-        </w:rPr>
-        <w:t xml:space="preserve">          return preco * quantidade * 0.9;</w:t>
+        <w:t xml:space="preserve">            return 0;</w:t>
         <w:br/>
       </w:r>
       <w:r>
@@ -845,73 +921,7 @@
           <w:color w:val="1F1F1F"/>
           <w:sz w:val="18"/>
         </w:rPr>
-        <w:t xml:space="preserve">      } else {</w:t>
-        <w:br/>
-      </w:r>
-      <w:r>
-        <w:rPr>
-          <w:rFonts w:ascii="Consolas" w:hAnsi="Consolas"/>
-          <w:b w:val="0"/>
-          <w:i w:val="0"/>
-          <w:color w:val="1F1F1F"/>
-          <w:sz w:val="18"/>
-        </w:rPr>
-        <w:t xml:space="preserve">        return preco * quantidade;</w:t>
-        <w:br/>
-      </w:r>
-      <w:r>
-        <w:rPr>
-          <w:rFonts w:ascii="Consolas" w:hAnsi="Consolas"/>
-          <w:b w:val="0"/>
-          <w:i w:val="0"/>
-          <w:color w:val="1F1F1F"/>
-          <w:sz w:val="18"/>
-        </w:rPr>
-        <w:t xml:space="preserve">      }</w:t>
-        <w:br/>
-      </w:r>
-      <w:r>
-        <w:rPr>
-          <w:rFonts w:ascii="Consolas" w:hAnsi="Consolas"/>
-          <w:b w:val="0"/>
-          <w:i w:val="0"/>
-          <w:color w:val="1F1F1F"/>
-          <w:sz w:val="18"/>
-        </w:rPr>
-        <w:t xml:space="preserve">    } else {</w:t>
-        <w:br/>
-      </w:r>
-      <w:r>
-        <w:rPr>
-          <w:rFonts w:ascii="Consolas" w:hAnsi="Consolas"/>
-          <w:b w:val="0"/>
-          <w:i w:val="0"/>
-          <w:color w:val="1F1F1F"/>
-          <w:sz w:val="18"/>
-        </w:rPr>
-        <w:t xml:space="preserve">      return 0;</w:t>
-        <w:br/>
-      </w:r>
-      <w:r>
-        <w:rPr>
-          <w:rFonts w:ascii="Consolas" w:hAnsi="Consolas"/>
-          <w:b w:val="0"/>
-          <w:i w:val="0"/>
-          <w:color w:val="1F1F1F"/>
-          <w:sz w:val="18"/>
-        </w:rPr>
         <w:t xml:space="preserve">    }</w:t>
-        <w:br/>
-      </w:r>
-      <w:r>
-        <w:rPr>
-          <w:rFonts w:ascii="Consolas" w:hAnsi="Consolas"/>
-          <w:b w:val="0"/>
-          <w:i w:val="0"/>
-          <w:color w:val="1F1F1F"/>
-          <w:sz w:val="18"/>
-        </w:rPr>
-        <w:t xml:space="preserve">  }</w:t>
         <w:br/>
       </w:r>
       <w:r>
@@ -2040,7 +2050,7 @@
                 <w:i w:val="0"/>
                 <w:sz w:val="20"/>
               </w:rPr>
-              <w:t>Validações extraídas para validarEntradas(), lançando exceção e evitando aninhamento profundo</w:t>
+              <w:t>processar() valida tipo/valor/cartão com retorno antecipado, sem aninhar ifs em cascata</w:t>
             </w:r>
           </w:p>
         </w:tc>
@@ -2076,7 +2086,7 @@
                 <w:i w:val="0"/>
                 <w:sz w:val="20"/>
               </w:rPr>
-              <w:t>Lógica de cálculo de taxa extraída para calcularTaxa(); validação extraída para validarEntradas()</w:t>
+              <w:t>processarTipo() e processarComTaxa() extraem a lógica antes repetida nos blocos de crédito/débito</w:t>
             </w:r>
           </w:p>
         </w:tc>
@@ -2095,7 +2105,7 @@
                 <w:i w:val="0"/>
                 <w:sz w:val="20"/>
               </w:rPr>
-              <w:t>Substituir == por .equals()</w:t>
+              <w:t>Substituir == por comparação segura</w:t>
             </w:r>
           </w:p>
         </w:tc>
@@ -2112,7 +2122,7 @@
                 <w:i w:val="0"/>
                 <w:sz w:val="20"/>
               </w:rPr>
-              <w:t>validarSenha() agora compara hash/salt via .equals() em vez de == entre Strings</w:t>
+              <w:t>validarSenha() usa MessageDigest.isEqual() (resistente a timing attack) em vez de == entre Strings</w:t>
             </w:r>
           </w:p>
         </w:tc>
@@ -2148,7 +2158,7 @@
                 <w:i w:val="0"/>
                 <w:sz w:val="20"/>
               </w:rPr>
-              <w:t>Validação por PBKDF2-HMAC-SHA256 + salt aleatório (600.000 iterações), hash/salt fornecidos externamente, conforme OWASP</w:t>
+              <w:t>Credencial (hash + salt) fornecida externamente via criarComCredencial(saltBase64, hashBase64); validação por PBKDF2-HMAC-SHA256, 600.000 iterações, conforme OWASP</w:t>
             </w:r>
           </w:p>
         </w:tc>
@@ -2184,7 +2194,7 @@
                 <w:i w:val="0"/>
                 <w:sz w:val="20"/>
               </w:rPr>
-              <w:t>TAXA_CREDITO, TAXA_DEBITO, TAMANHO_CARTAO, DESCONTO_10/20/30 substituem os números mágicos</w:t>
+              <w:t>TAXA_CREDITO/DEBITO, TAMANHO_CARTAO, LIMITE_DESCONTO_10/20/30, FATOR_DESCONTO_10/20/30, ITERACOES_PBKDF2 e outras substituem os números mágicos</w:t>
             </w:r>
           </w:p>
         </w:tc>
@@ -2220,7 +2230,7 @@
                 <w:i w:val="0"/>
                 <w:sz w:val="20"/>
               </w:rPr>
-              <w:t>Javadoc adicionado na classe e nos métodos públicos processar(), validarSenha() e calcularDesconto()</w:t>
+              <w:t>Javadoc com @param/@return/@throws na classe e nos métodos públicos</w:t>
             </w:r>
           </w:p>
         </w:tc>
@@ -2256,7 +2266,7 @@
                 <w:i w:val="0"/>
                 <w:sz w:val="20"/>
               </w:rPr>
-              <w:t>Padronizado em 2 espaços por nível, sem aninhamento além de 1 nível por método</w:t>
+              <w:t>Padronizado em 4 espaços por nível (perfil usado na comparação principal do Checkstyle)</w:t>
             </w:r>
           </w:p>
         </w:tc>
@@ -2292,7 +2302,7 @@
                 <w:i w:val="0"/>
                 <w:sz w:val="20"/>
               </w:rPr>
-              <w:t>import java.util.*; substituído por import java.security.MessageDigest; e import java.util.Base64;</w:t>
+              <w:t>import java.util.*; substituído por imports específicos (MessageDigest, SecretKeyFactory, PBEKeySpec, Base64, Arrays etc.)</w:t>
             </w:r>
           </w:p>
         </w:tc>
@@ -2330,7 +2340,7 @@
           <w:color w:val="1F1F1F"/>
           <w:sz w:val="18"/>
         </w:rPr>
-        <w:t>package src;</w:t>
+        <w:t>package src;</w:t>
         <w:br/>
       </w:r>
       <w:r>
@@ -2351,7 +2361,7 @@
           <w:color w:val="1F1F1F"/>
           <w:sz w:val="18"/>
         </w:rPr>
-        <w:t>// imports reais: javax.crypto / java.security.SecureRandom / java.util.Base64</w:t>
+        <w:t>import java.security.MessageDigest;</w:t>
         <w:br/>
       </w:r>
       <w:r>
@@ -2362,7 +2372,62 @@
           <w:color w:val="1F1F1F"/>
           <w:sz w:val="18"/>
         </w:rPr>
-        <w:t>// (PBKDF2-HMAC-SHA256 — ver código-fonte completo do projeto)</w:t>
+        <w:t>import java.security.NoSuchAlgorithmException;</w:t>
+        <w:br/>
+      </w:r>
+      <w:r>
+        <w:rPr>
+          <w:rFonts w:ascii="Consolas" w:hAnsi="Consolas"/>
+          <w:b w:val="0"/>
+          <w:i w:val="0"/>
+          <w:color w:val="1F1F1F"/>
+          <w:sz w:val="18"/>
+        </w:rPr>
+        <w:t>import java.security.spec.InvalidKeySpecException;</w:t>
+        <w:br/>
+      </w:r>
+      <w:r>
+        <w:rPr>
+          <w:rFonts w:ascii="Consolas" w:hAnsi="Consolas"/>
+          <w:b w:val="0"/>
+          <w:i w:val="0"/>
+          <w:color w:val="1F1F1F"/>
+          <w:sz w:val="18"/>
+        </w:rPr>
+        <w:t>import java.util.Arrays;</w:t>
+        <w:br/>
+      </w:r>
+      <w:r>
+        <w:rPr>
+          <w:rFonts w:ascii="Consolas" w:hAnsi="Consolas"/>
+          <w:b w:val="0"/>
+          <w:i w:val="0"/>
+          <w:color w:val="1F1F1F"/>
+          <w:sz w:val="18"/>
+        </w:rPr>
+        <w:t>import java.util.Base64;</w:t>
+        <w:br/>
+      </w:r>
+      <w:r>
+        <w:rPr>
+          <w:rFonts w:ascii="Consolas" w:hAnsi="Consolas"/>
+          <w:b w:val="0"/>
+          <w:i w:val="0"/>
+          <w:color w:val="1F1F1F"/>
+          <w:sz w:val="18"/>
+        </w:rPr>
+        <w:t>import javax.crypto.SecretKeyFactory;</w:t>
+        <w:br/>
+      </w:r>
+      <w:r>
+        <w:rPr>
+          <w:rFonts w:ascii="Consolas" w:hAnsi="Consolas"/>
+          <w:b w:val="0"/>
+          <w:i w:val="0"/>
+          <w:color w:val="1F1F1F"/>
+          <w:sz w:val="18"/>
+        </w:rPr>
+        <w:t>import javax.crypto.spec.PBEKeySpec;</w:t>
         <w:br/>
       </w:r>
       <w:r>
@@ -2383,7 +2448,7 @@
           <w:color w:val="1F1F1F"/>
           <w:sz w:val="18"/>
         </w:rPr>
-        <w:t>/**</w:t>
+        <w:t>/** Processa pagamentos e descontos e verifica uma credencial fornecida externamente. */</w:t>
         <w:br/>
       </w:r>
       <w:r>
@@ -2394,29 +2459,7 @@
           <w:color w:val="1F1F1F"/>
           <w:sz w:val="18"/>
         </w:rPr>
-        <w:t xml:space="preserve"> * Processador de pagamentos com diferentes tipos de transação.</w:t>
-        <w:br/>
-      </w:r>
-      <w:r>
-        <w:rPr>
-          <w:rFonts w:ascii="Consolas" w:hAnsi="Consolas"/>
-          <w:b w:val="0"/>
-          <w:i w:val="0"/>
-          <w:color w:val="1F1F1F"/>
-          <w:sz w:val="18"/>
-        </w:rPr>
-        <w:t xml:space="preserve"> */</w:t>
-        <w:br/>
-      </w:r>
-      <w:r>
-        <w:rPr>
-          <w:rFonts w:ascii="Consolas" w:hAnsi="Consolas"/>
-          <w:b w:val="0"/>
-          <w:i w:val="0"/>
-          <w:color w:val="1F1F1F"/>
-          <w:sz w:val="18"/>
-        </w:rPr>
-        <w:t>public class ProcessadorPagamento {</w:t>
+        <w:t>public class ProcessadorPagamento {</w:t>
         <w:br/>
       </w:r>
       <w:r>
@@ -2437,7 +2480,7 @@
           <w:color w:val="1F1F1F"/>
           <w:sz w:val="18"/>
         </w:rPr>
-        <w:t xml:space="preserve">  private static final double TAXA_CREDITO = 0.05;</w:t>
+        <w:t xml:space="preserve">    private static final double TAXA_CREDITO = 0.05;</w:t>
         <w:br/>
       </w:r>
       <w:r>
@@ -2448,7 +2491,7 @@
           <w:color w:val="1F1F1F"/>
           <w:sz w:val="18"/>
         </w:rPr>
-        <w:t xml:space="preserve">  private static final double TAXA_DEBITO = 0.02;</w:t>
+        <w:t xml:space="preserve">    private static final double TAXA_DEBITO = 0.02;</w:t>
         <w:br/>
       </w:r>
       <w:r>
@@ -2459,7 +2502,7 @@
           <w:color w:val="1F1F1F"/>
           <w:sz w:val="18"/>
         </w:rPr>
-        <w:t xml:space="preserve">  private static final int TAMANHO_CARTAO = 16;</w:t>
+        <w:t xml:space="preserve">    private static final int TAMANHO_CARTAO = 16;</w:t>
         <w:br/>
       </w:r>
       <w:r>
@@ -2470,7 +2513,7 @@
           <w:color w:val="1F1F1F"/>
           <w:sz w:val="18"/>
         </w:rPr>
-        <w:t xml:space="preserve">  private static final int DESCONTO_10 = 10;</w:t>
+        <w:t xml:space="preserve">    private static final int LIMITE_DESCONTO_10 = 10;</w:t>
         <w:br/>
       </w:r>
       <w:r>
@@ -2481,7 +2524,7 @@
           <w:color w:val="1F1F1F"/>
           <w:sz w:val="18"/>
         </w:rPr>
-        <w:t xml:space="preserve">  private static final int DESCONTO_20 = 50;</w:t>
+        <w:t xml:space="preserve">    private static final int LIMITE_DESCONTO_20 = 50;</w:t>
         <w:br/>
       </w:r>
       <w:r>
@@ -2492,7 +2535,95 @@
           <w:color w:val="1F1F1F"/>
           <w:sz w:val="18"/>
         </w:rPr>
-        <w:t xml:space="preserve">  private static final int DESCONTO_30 = 100;</w:t>
+        <w:t xml:space="preserve">    private static final int LIMITE_DESCONTO_30 = 100;</w:t>
+        <w:br/>
+      </w:r>
+      <w:r>
+        <w:rPr>
+          <w:rFonts w:ascii="Consolas" w:hAnsi="Consolas"/>
+          <w:b w:val="0"/>
+          <w:i w:val="0"/>
+          <w:color w:val="1F1F1F"/>
+          <w:sz w:val="18"/>
+        </w:rPr>
+        <w:t xml:space="preserve">    private static final double FATOR_DESCONTO_10 = 0.9;</w:t>
+        <w:br/>
+      </w:r>
+      <w:r>
+        <w:rPr>
+          <w:rFonts w:ascii="Consolas" w:hAnsi="Consolas"/>
+          <w:b w:val="0"/>
+          <w:i w:val="0"/>
+          <w:color w:val="1F1F1F"/>
+          <w:sz w:val="18"/>
+        </w:rPr>
+        <w:t xml:space="preserve">    private static final double FATOR_DESCONTO_20 = 0.8;</w:t>
+        <w:br/>
+      </w:r>
+      <w:r>
+        <w:rPr>
+          <w:rFonts w:ascii="Consolas" w:hAnsi="Consolas"/>
+          <w:b w:val="0"/>
+          <w:i w:val="0"/>
+          <w:color w:val="1F1F1F"/>
+          <w:sz w:val="18"/>
+        </w:rPr>
+        <w:t xml:space="preserve">    private static final double FATOR_DESCONTO_30 = 0.7;</w:t>
+        <w:br/>
+      </w:r>
+      <w:r>
+        <w:rPr>
+          <w:rFonts w:ascii="Consolas" w:hAnsi="Consolas"/>
+          <w:b w:val="0"/>
+          <w:i w:val="0"/>
+          <w:color w:val="1F1F1F"/>
+          <w:sz w:val="18"/>
+        </w:rPr>
+        <w:t xml:space="preserve">    private static final int ITERACOES_PBKDF2 = 600_000;</w:t>
+        <w:br/>
+      </w:r>
+      <w:r>
+        <w:rPr>
+          <w:rFonts w:ascii="Consolas" w:hAnsi="Consolas"/>
+          <w:b w:val="0"/>
+          <w:i w:val="0"/>
+          <w:color w:val="1F1F1F"/>
+          <w:sz w:val="18"/>
+        </w:rPr>
+        <w:t xml:space="preserve">    private static final int TAMANHO_HASH_BITS = 256;</w:t>
+        <w:br/>
+      </w:r>
+      <w:r>
+        <w:rPr>
+          <w:rFonts w:ascii="Consolas" w:hAnsi="Consolas"/>
+          <w:b w:val="0"/>
+          <w:i w:val="0"/>
+          <w:color w:val="1F1F1F"/>
+          <w:sz w:val="18"/>
+        </w:rPr>
+        <w:t xml:space="preserve">    private static final int TAMANHO_HASH_BYTES = 32;</w:t>
+        <w:br/>
+      </w:r>
+      <w:r>
+        <w:rPr>
+          <w:rFonts w:ascii="Consolas" w:hAnsi="Consolas"/>
+          <w:b w:val="0"/>
+          <w:i w:val="0"/>
+          <w:color w:val="1F1F1F"/>
+          <w:sz w:val="18"/>
+        </w:rPr>
+        <w:t xml:space="preserve">    private static final int MINIMO_SALT_BYTES = 16;</w:t>
+        <w:br/>
+      </w:r>
+      <w:r>
+        <w:rPr>
+          <w:rFonts w:ascii="Consolas" w:hAnsi="Consolas"/>
+          <w:b w:val="0"/>
+          <w:i w:val="0"/>
+          <w:color w:val="1F1F1F"/>
+          <w:sz w:val="18"/>
+        </w:rPr>
+        <w:t xml:space="preserve">    private static final String ALGORITMO_SENHA = "PBKDF2WithHmacSHA256";</w:t>
         <w:br/>
       </w:r>
       <w:r>
@@ -2513,7 +2644,7 @@
           <w:color w:val="1F1F1F"/>
           <w:sz w:val="18"/>
         </w:rPr>
-        <w:t xml:space="preserve">  /**</w:t>
+        <w:t xml:space="preserve">    private final byte[] salt;</w:t>
         <w:br/>
       </w:r>
       <w:r>
@@ -2524,84 +2655,7 @@
           <w:color w:val="1F1F1F"/>
           <w:sz w:val="18"/>
         </w:rPr>
-        <w:t xml:space="preserve">   * Processa um pagamento com base no tipo, valor e cartão.</w:t>
-        <w:br/>
-      </w:r>
-      <w:r>
-        <w:rPr>
-          <w:rFonts w:ascii="Consolas" w:hAnsi="Consolas"/>
-          <w:b w:val="0"/>
-          <w:i w:val="0"/>
-          <w:color w:val="1F1F1F"/>
-          <w:sz w:val="18"/>
-        </w:rPr>
-        <w:t xml:space="preserve">   *</w:t>
-        <w:br/>
-      </w:r>
-      <w:r>
-        <w:rPr>
-          <w:rFonts w:ascii="Consolas" w:hAnsi="Consolas"/>
-          <w:b w:val="0"/>
-          <w:i w:val="0"/>
-          <w:color w:val="1F1F1F"/>
-          <w:sz w:val="18"/>
-        </w:rPr>
-        <w:t xml:space="preserve">   * @param tipo   Tipo de pagamento (credito, debito, pix)</w:t>
-        <w:br/>
-      </w:r>
-      <w:r>
-        <w:rPr>
-          <w:rFonts w:ascii="Consolas" w:hAnsi="Consolas"/>
-          <w:b w:val="0"/>
-          <w:i w:val="0"/>
-          <w:color w:val="1F1F1F"/>
-          <w:sz w:val="18"/>
-        </w:rPr>
-        <w:t xml:space="preserve">   * @param valor  Valor da transação</w:t>
-        <w:br/>
-      </w:r>
-      <w:r>
-        <w:rPr>
-          <w:rFonts w:ascii="Consolas" w:hAnsi="Consolas"/>
-          <w:b w:val="0"/>
-          <w:i w:val="0"/>
-          <w:color w:val="1F1F1F"/>
-          <w:sz w:val="18"/>
-        </w:rPr>
-        <w:t xml:space="preserve">   * @param cartao Número do cartão (16 dígitos)</w:t>
-        <w:br/>
-      </w:r>
-      <w:r>
-        <w:rPr>
-          <w:rFonts w:ascii="Consolas" w:hAnsi="Consolas"/>
-          <w:b w:val="0"/>
-          <w:i w:val="0"/>
-          <w:color w:val="1F1F1F"/>
-          <w:sz w:val="18"/>
-        </w:rPr>
-        <w:t xml:space="preserve">   */</w:t>
-        <w:br/>
-      </w:r>
-      <w:r>
-        <w:rPr>
-          <w:rFonts w:ascii="Consolas" w:hAnsi="Consolas"/>
-          <w:b w:val="0"/>
-          <w:i w:val="0"/>
-          <w:color w:val="1F1F1F"/>
-          <w:sz w:val="18"/>
-        </w:rPr>
-        <w:t xml:space="preserve">  public void processar(String tipo, double valor, String cartao) {</w:t>
-        <w:br/>
-      </w:r>
-      <w:r>
-        <w:rPr>
-          <w:rFonts w:ascii="Consolas" w:hAnsi="Consolas"/>
-          <w:b w:val="0"/>
-          <w:i w:val="0"/>
-          <w:color w:val="1F1F1F"/>
-          <w:sz w:val="18"/>
-        </w:rPr>
-        <w:t xml:space="preserve">    validarEntradas(tipo, valor, cartao);</w:t>
+        <w:t xml:space="preserve">    private final byte[] hashEsperado;</w:t>
         <w:br/>
       </w:r>
       <w:r>
@@ -2622,7 +2676,7 @@
           <w:color w:val="1F1F1F"/>
           <w:sz w:val="18"/>
         </w:rPr>
-        <w:t xml:space="preserve">    double taxa = calcularTaxa(tipo);</w:t>
+        <w:t xml:space="preserve">    private ProcessadorPagamento(byte[] salt, byte[] hashEsperado) {</w:t>
         <w:br/>
       </w:r>
       <w:r>
@@ -2633,7 +2687,7 @@
           <w:color w:val="1F1F1F"/>
           <w:sz w:val="18"/>
         </w:rPr>
-        <w:t xml:space="preserve">    double total = valor + (valor * taxa);</w:t>
+        <w:t xml:space="preserve">        this.salt = salt.clone();</w:t>
         <w:br/>
       </w:r>
       <w:r>
@@ -2644,82 +2698,7 @@
           <w:color w:val="1F1F1F"/>
           <w:sz w:val="18"/>
         </w:rPr>
-        <w:br/>
-      </w:r>
-      <w:r>
-        <w:rPr>
-          <w:rFonts w:ascii="Consolas" w:hAnsi="Consolas"/>
-          <w:b w:val="0"/>
-          <w:i w:val="0"/>
-          <w:color w:val="1F1F1F"/>
-          <w:sz w:val="18"/>
-        </w:rPr>
-        <w:t xml:space="preserve">    System.out.println("Processando " + tipo + " de R$ " + valor);</w:t>
-        <w:br/>
-      </w:r>
-      <w:r>
-        <w:rPr>
-          <w:rFonts w:ascii="Consolas" w:hAnsi="Consolas"/>
-          <w:b w:val="0"/>
-          <w:i w:val="0"/>
-          <w:color w:val="1F1F1F"/>
-          <w:sz w:val="18"/>
-        </w:rPr>
-        <w:t xml:space="preserve">    System.out.println("Total com taxa: R$ " + total);</w:t>
-        <w:br/>
-      </w:r>
-      <w:r>
-        <w:rPr>
-          <w:rFonts w:ascii="Consolas" w:hAnsi="Consolas"/>
-          <w:b w:val="0"/>
-          <w:i w:val="0"/>
-          <w:color w:val="1F1F1F"/>
-          <w:sz w:val="18"/>
-        </w:rPr>
-        <w:t xml:space="preserve">  }</w:t>
-        <w:br/>
-      </w:r>
-      <w:r>
-        <w:rPr>
-          <w:rFonts w:ascii="Consolas" w:hAnsi="Consolas"/>
-          <w:b w:val="0"/>
-          <w:i w:val="0"/>
-          <w:color w:val="1F1F1F"/>
-          <w:sz w:val="18"/>
-        </w:rPr>
-        <w:br/>
-      </w:r>
-      <w:r>
-        <w:rPr>
-          <w:rFonts w:ascii="Consolas" w:hAnsi="Consolas"/>
-          <w:b w:val="0"/>
-          <w:i w:val="0"/>
-          <w:color w:val="1F1F1F"/>
-          <w:sz w:val="18"/>
-        </w:rPr>
-        <w:t xml:space="preserve">  private void validarEntradas(String tipo, double valor, String cartao) {</w:t>
-        <w:br/>
-      </w:r>
-      <w:r>
-        <w:rPr>
-          <w:rFonts w:ascii="Consolas" w:hAnsi="Consolas"/>
-          <w:b w:val="0"/>
-          <w:i w:val="0"/>
-          <w:color w:val="1F1F1F"/>
-          <w:sz w:val="18"/>
-        </w:rPr>
-        <w:t xml:space="preserve">    if (tipo == null || tipo.isEmpty()) {</w:t>
-        <w:br/>
-      </w:r>
-      <w:r>
-        <w:rPr>
-          <w:rFonts w:ascii="Consolas" w:hAnsi="Consolas"/>
-          <w:b w:val="0"/>
-          <w:i w:val="0"/>
-          <w:color w:val="1F1F1F"/>
-          <w:sz w:val="18"/>
-        </w:rPr>
-        <w:t xml:space="preserve">      throw new IllegalArgumentException("Tipo inválido");</w:t>
+        <w:t xml:space="preserve">        this.hashEsperado = hashEsperado.clone();</w:t>
         <w:br/>
       </w:r>
       <w:r>
@@ -2741,7 +2720,6 @@
           <w:color w:val="1F1F1F"/>
           <w:sz w:val="18"/>
         </w:rPr>
-        <w:t xml:space="preserve">    if (valor &lt;= 0) {</w:t>
         <w:br/>
       </w:r>
       <w:r>
@@ -2752,7 +2730,271 @@
           <w:color w:val="1F1F1F"/>
           <w:sz w:val="18"/>
         </w:rPr>
-        <w:t xml:space="preserve">      throw new IllegalArgumentException("Valor inválido");</w:t>
+        <w:t xml:space="preserve">    /**</w:t>
+        <w:br/>
+      </w:r>
+      <w:r>
+        <w:rPr>
+          <w:rFonts w:ascii="Consolas" w:hAnsi="Consolas"/>
+          <w:b w:val="0"/>
+          <w:i w:val="0"/>
+          <w:color w:val="1F1F1F"/>
+          <w:sz w:val="18"/>
+        </w:rPr>
+        <w:t xml:space="preserve">     * Cria o processador a partir de hash e salt persistidos pelo cadastro.</w:t>
+        <w:br/>
+      </w:r>
+      <w:r>
+        <w:rPr>
+          <w:rFonts w:ascii="Consolas" w:hAnsi="Consolas"/>
+          <w:b w:val="0"/>
+          <w:i w:val="0"/>
+          <w:color w:val="1F1F1F"/>
+          <w:sz w:val="18"/>
+        </w:rPr>
+        <w:t xml:space="preserve">     *</w:t>
+        <w:br/>
+      </w:r>
+      <w:r>
+        <w:rPr>
+          <w:rFonts w:ascii="Consolas" w:hAnsi="Consolas"/>
+          <w:b w:val="0"/>
+          <w:i w:val="0"/>
+          <w:color w:val="1F1F1F"/>
+          <w:sz w:val="18"/>
+        </w:rPr>
+        <w:t xml:space="preserve">     * @param saltBase64 salt aleatorio de pelo menos 16 bytes, codificado em Base64</w:t>
+        <w:br/>
+      </w:r>
+      <w:r>
+        <w:rPr>
+          <w:rFonts w:ascii="Consolas" w:hAnsi="Consolas"/>
+          <w:b w:val="0"/>
+          <w:i w:val="0"/>
+          <w:color w:val="1F1F1F"/>
+          <w:sz w:val="18"/>
+        </w:rPr>
+        <w:t xml:space="preserve">     * @param hashBase64 hash de 32 bytes, codificado em Base64</w:t>
+        <w:br/>
+      </w:r>
+      <w:r>
+        <w:rPr>
+          <w:rFonts w:ascii="Consolas" w:hAnsi="Consolas"/>
+          <w:b w:val="0"/>
+          <w:i w:val="0"/>
+          <w:color w:val="1F1F1F"/>
+          <w:sz w:val="18"/>
+        </w:rPr>
+        <w:t xml:space="preserve">     * @return processador configurado</w:t>
+        <w:br/>
+      </w:r>
+      <w:r>
+        <w:rPr>
+          <w:rFonts w:ascii="Consolas" w:hAnsi="Consolas"/>
+          <w:b w:val="0"/>
+          <w:i w:val="0"/>
+          <w:color w:val="1F1F1F"/>
+          <w:sz w:val="18"/>
+        </w:rPr>
+        <w:t xml:space="preserve">     * @throws IllegalArgumentException se os dados estiverem ausentes, malformados ou invalidos</w:t>
+        <w:br/>
+      </w:r>
+      <w:r>
+        <w:rPr>
+          <w:rFonts w:ascii="Consolas" w:hAnsi="Consolas"/>
+          <w:b w:val="0"/>
+          <w:i w:val="0"/>
+          <w:color w:val="1F1F1F"/>
+          <w:sz w:val="18"/>
+        </w:rPr>
+        <w:t xml:space="preserve">     */</w:t>
+        <w:br/>
+      </w:r>
+      <w:r>
+        <w:rPr>
+          <w:rFonts w:ascii="Consolas" w:hAnsi="Consolas"/>
+          <w:b w:val="0"/>
+          <w:i w:val="0"/>
+          <w:color w:val="1F1F1F"/>
+          <w:sz w:val="18"/>
+        </w:rPr>
+        <w:t xml:space="preserve">    public static ProcessadorPagamento criarComCredencial(String saltBase64, String hashBase64) {</w:t>
+        <w:br/>
+      </w:r>
+      <w:r>
+        <w:rPr>
+          <w:rFonts w:ascii="Consolas" w:hAnsi="Consolas"/>
+          <w:b w:val="0"/>
+          <w:i w:val="0"/>
+          <w:color w:val="1F1F1F"/>
+          <w:sz w:val="18"/>
+        </w:rPr>
+        <w:t xml:space="preserve">        if (saltBase64 == null || hashBase64 == null) {</w:t>
+        <w:br/>
+      </w:r>
+      <w:r>
+        <w:rPr>
+          <w:rFonts w:ascii="Consolas" w:hAnsi="Consolas"/>
+          <w:b w:val="0"/>
+          <w:i w:val="0"/>
+          <w:color w:val="1F1F1F"/>
+          <w:sz w:val="18"/>
+        </w:rPr>
+        <w:t xml:space="preserve">            throw new IllegalArgumentException("Salt e hash devem ser configurados");</w:t>
+        <w:br/>
+      </w:r>
+      <w:r>
+        <w:rPr>
+          <w:rFonts w:ascii="Consolas" w:hAnsi="Consolas"/>
+          <w:b w:val="0"/>
+          <w:i w:val="0"/>
+          <w:color w:val="1F1F1F"/>
+          <w:sz w:val="18"/>
+        </w:rPr>
+        <w:t xml:space="preserve">        }</w:t>
+        <w:br/>
+      </w:r>
+      <w:r>
+        <w:rPr>
+          <w:rFonts w:ascii="Consolas" w:hAnsi="Consolas"/>
+          <w:b w:val="0"/>
+          <w:i w:val="0"/>
+          <w:color w:val="1F1F1F"/>
+          <w:sz w:val="18"/>
+        </w:rPr>
+        <w:t xml:space="preserve">        byte[] saltConfigurado;</w:t>
+        <w:br/>
+      </w:r>
+      <w:r>
+        <w:rPr>
+          <w:rFonts w:ascii="Consolas" w:hAnsi="Consolas"/>
+          <w:b w:val="0"/>
+          <w:i w:val="0"/>
+          <w:color w:val="1F1F1F"/>
+          <w:sz w:val="18"/>
+        </w:rPr>
+        <w:t xml:space="preserve">        byte[] hashConfigurado;</w:t>
+        <w:br/>
+      </w:r>
+      <w:r>
+        <w:rPr>
+          <w:rFonts w:ascii="Consolas" w:hAnsi="Consolas"/>
+          <w:b w:val="0"/>
+          <w:i w:val="0"/>
+          <w:color w:val="1F1F1F"/>
+          <w:sz w:val="18"/>
+        </w:rPr>
+        <w:t xml:space="preserve">        try {</w:t>
+        <w:br/>
+      </w:r>
+      <w:r>
+        <w:rPr>
+          <w:rFonts w:ascii="Consolas" w:hAnsi="Consolas"/>
+          <w:b w:val="0"/>
+          <w:i w:val="0"/>
+          <w:color w:val="1F1F1F"/>
+          <w:sz w:val="18"/>
+        </w:rPr>
+        <w:t xml:space="preserve">            saltConfigurado = Base64.getDecoder().decode(saltBase64);</w:t>
+        <w:br/>
+      </w:r>
+      <w:r>
+        <w:rPr>
+          <w:rFonts w:ascii="Consolas" w:hAnsi="Consolas"/>
+          <w:b w:val="0"/>
+          <w:i w:val="0"/>
+          <w:color w:val="1F1F1F"/>
+          <w:sz w:val="18"/>
+        </w:rPr>
+        <w:t xml:space="preserve">            hashConfigurado = Base64.getDecoder().decode(hashBase64);</w:t>
+        <w:br/>
+      </w:r>
+      <w:r>
+        <w:rPr>
+          <w:rFonts w:ascii="Consolas" w:hAnsi="Consolas"/>
+          <w:b w:val="0"/>
+          <w:i w:val="0"/>
+          <w:color w:val="1F1F1F"/>
+          <w:sz w:val="18"/>
+        </w:rPr>
+        <w:t xml:space="preserve">        } catch (IllegalArgumentException erro) {</w:t>
+        <w:br/>
+      </w:r>
+      <w:r>
+        <w:rPr>
+          <w:rFonts w:ascii="Consolas" w:hAnsi="Consolas"/>
+          <w:b w:val="0"/>
+          <w:i w:val="0"/>
+          <w:color w:val="1F1F1F"/>
+          <w:sz w:val="18"/>
+        </w:rPr>
+        <w:t xml:space="preserve">            throw new IllegalArgumentException("Credencial Base64 invalida", erro);</w:t>
+        <w:br/>
+      </w:r>
+      <w:r>
+        <w:rPr>
+          <w:rFonts w:ascii="Consolas" w:hAnsi="Consolas"/>
+          <w:b w:val="0"/>
+          <w:i w:val="0"/>
+          <w:color w:val="1F1F1F"/>
+          <w:sz w:val="18"/>
+        </w:rPr>
+        <w:t xml:space="preserve">        }</w:t>
+        <w:br/>
+      </w:r>
+      <w:r>
+        <w:rPr>
+          <w:rFonts w:ascii="Consolas" w:hAnsi="Consolas"/>
+          <w:b w:val="0"/>
+          <w:i w:val="0"/>
+          <w:color w:val="1F1F1F"/>
+          <w:sz w:val="18"/>
+        </w:rPr>
+        <w:t xml:space="preserve">        if (saltConfigurado.length &lt; MINIMO_SALT_BYTES</w:t>
+        <w:br/>
+      </w:r>
+      <w:r>
+        <w:rPr>
+          <w:rFonts w:ascii="Consolas" w:hAnsi="Consolas"/>
+          <w:b w:val="0"/>
+          <w:i w:val="0"/>
+          <w:color w:val="1F1F1F"/>
+          <w:sz w:val="18"/>
+        </w:rPr>
+        <w:t xml:space="preserve">                || hashConfigurado.length != TAMANHO_HASH_BYTES) {</w:t>
+        <w:br/>
+      </w:r>
+      <w:r>
+        <w:rPr>
+          <w:rFonts w:ascii="Consolas" w:hAnsi="Consolas"/>
+          <w:b w:val="0"/>
+          <w:i w:val="0"/>
+          <w:color w:val="1F1F1F"/>
+          <w:sz w:val="18"/>
+        </w:rPr>
+        <w:t xml:space="preserve">            throw new IllegalArgumentException("Tamanho de salt ou hash invalido");</w:t>
+        <w:br/>
+      </w:r>
+      <w:r>
+        <w:rPr>
+          <w:rFonts w:ascii="Consolas" w:hAnsi="Consolas"/>
+          <w:b w:val="0"/>
+          <w:i w:val="0"/>
+          <w:color w:val="1F1F1F"/>
+          <w:sz w:val="18"/>
+        </w:rPr>
+        <w:t xml:space="preserve">        }</w:t>
+        <w:br/>
+      </w:r>
+      <w:r>
+        <w:rPr>
+          <w:rFonts w:ascii="Consolas" w:hAnsi="Consolas"/>
+          <w:b w:val="0"/>
+          <w:i w:val="0"/>
+          <w:color w:val="1F1F1F"/>
+          <w:sz w:val="18"/>
+        </w:rPr>
+        <w:t xml:space="preserve">        return new ProcessadorPagamento(saltConfigurado, hashConfigurado);</w:t>
         <w:br/>
       </w:r>
       <w:r>
@@ -2774,7 +3016,6 @@
           <w:color w:val="1F1F1F"/>
           <w:sz w:val="18"/>
         </w:rPr>
-        <w:t xml:space="preserve">    if (cartao == null || cartao.length() != TAMANHO_CARTAO) {</w:t>
         <w:br/>
       </w:r>
       <w:r>
@@ -2785,7 +3026,260 @@
           <w:color w:val="1F1F1F"/>
           <w:sz w:val="18"/>
         </w:rPr>
-        <w:t xml:space="preserve">      throw new IllegalArgumentException("Cartão inválido");</w:t>
+        <w:t xml:space="preserve">    /**</w:t>
+        <w:br/>
+      </w:r>
+      <w:r>
+        <w:rPr>
+          <w:rFonts w:ascii="Consolas" w:hAnsi="Consolas"/>
+          <w:b w:val="0"/>
+          <w:i w:val="0"/>
+          <w:color w:val="1F1F1F"/>
+          <w:sz w:val="18"/>
+        </w:rPr>
+        <w:t xml:space="preserve">     * Processa um pagamento, preservando as mensagens e as regras do exercicio original.</w:t>
+        <w:br/>
+      </w:r>
+      <w:r>
+        <w:rPr>
+          <w:rFonts w:ascii="Consolas" w:hAnsi="Consolas"/>
+          <w:b w:val="0"/>
+          <w:i w:val="0"/>
+          <w:color w:val="1F1F1F"/>
+          <w:sz w:val="18"/>
+        </w:rPr>
+        <w:t xml:space="preserve">     *</w:t>
+        <w:br/>
+      </w:r>
+      <w:r>
+        <w:rPr>
+          <w:rFonts w:ascii="Consolas" w:hAnsi="Consolas"/>
+          <w:b w:val="0"/>
+          <w:i w:val="0"/>
+          <w:color w:val="1F1F1F"/>
+          <w:sz w:val="18"/>
+        </w:rPr>
+        <w:t xml:space="preserve">     * &lt;p&gt;Por compatibilidade com o enunciado, o cartao de 16 caracteres tambem e exigido</w:t>
+        <w:br/>
+      </w:r>
+      <w:r>
+        <w:rPr>
+          <w:rFonts w:ascii="Consolas" w:hAnsi="Consolas"/>
+          <w:b w:val="0"/>
+          <w:i w:val="0"/>
+          <w:color w:val="1F1F1F"/>
+          <w:sz w:val="18"/>
+        </w:rPr>
+        <w:t xml:space="preserve">     * para PIX. Esta e uma limitacao didatica, nao uma regra de um sistema real de PIX.</w:t>
+        <w:br/>
+      </w:r>
+      <w:r>
+        <w:rPr>
+          <w:rFonts w:ascii="Consolas" w:hAnsi="Consolas"/>
+          <w:b w:val="0"/>
+          <w:i w:val="0"/>
+          <w:color w:val="1F1F1F"/>
+          <w:sz w:val="18"/>
+        </w:rPr>
+        <w:t xml:space="preserve">     *</w:t>
+        <w:br/>
+      </w:r>
+      <w:r>
+        <w:rPr>
+          <w:rFonts w:ascii="Consolas" w:hAnsi="Consolas"/>
+          <w:b w:val="0"/>
+          <w:i w:val="0"/>
+          <w:color w:val="1F1F1F"/>
+          <w:sz w:val="18"/>
+        </w:rPr>
+        <w:t xml:space="preserve">     * @param tipo tipo de pagamento: credito, debito ou pix</w:t>
+        <w:br/>
+      </w:r>
+      <w:r>
+        <w:rPr>
+          <w:rFonts w:ascii="Consolas" w:hAnsi="Consolas"/>
+          <w:b w:val="0"/>
+          <w:i w:val="0"/>
+          <w:color w:val="1F1F1F"/>
+          <w:sz w:val="18"/>
+        </w:rPr>
+        <w:t xml:space="preserve">     * @param valor valor da transacao</w:t>
+        <w:br/>
+      </w:r>
+      <w:r>
+        <w:rPr>
+          <w:rFonts w:ascii="Consolas" w:hAnsi="Consolas"/>
+          <w:b w:val="0"/>
+          <w:i w:val="0"/>
+          <w:color w:val="1F1F1F"/>
+          <w:sz w:val="18"/>
+        </w:rPr>
+        <w:t xml:space="preserve">     * @param cartao identificador de cartao com 16 caracteres</w:t>
+        <w:br/>
+      </w:r>
+      <w:r>
+        <w:rPr>
+          <w:rFonts w:ascii="Consolas" w:hAnsi="Consolas"/>
+          <w:b w:val="0"/>
+          <w:i w:val="0"/>
+          <w:color w:val="1F1F1F"/>
+          <w:sz w:val="18"/>
+        </w:rPr>
+        <w:t xml:space="preserve">     */</w:t>
+        <w:br/>
+      </w:r>
+      <w:r>
+        <w:rPr>
+          <w:rFonts w:ascii="Consolas" w:hAnsi="Consolas"/>
+          <w:b w:val="0"/>
+          <w:i w:val="0"/>
+          <w:color w:val="1F1F1F"/>
+          <w:sz w:val="18"/>
+        </w:rPr>
+        <w:t xml:space="preserve">    public void processar(String tipo, double valor, String cartao) {</w:t>
+        <w:br/>
+      </w:r>
+      <w:r>
+        <w:rPr>
+          <w:rFonts w:ascii="Consolas" w:hAnsi="Consolas"/>
+          <w:b w:val="0"/>
+          <w:i w:val="0"/>
+          <w:color w:val="1F1F1F"/>
+          <w:sz w:val="18"/>
+        </w:rPr>
+        <w:t xml:space="preserve">        if (tipo == null || tipo.isEmpty()) {</w:t>
+        <w:br/>
+      </w:r>
+      <w:r>
+        <w:rPr>
+          <w:rFonts w:ascii="Consolas" w:hAnsi="Consolas"/>
+          <w:b w:val="0"/>
+          <w:i w:val="0"/>
+          <w:color w:val="1F1F1F"/>
+          <w:sz w:val="18"/>
+        </w:rPr>
+        <w:t xml:space="preserve">            System.out.println("Tipo inválido");</w:t>
+        <w:br/>
+      </w:r>
+      <w:r>
+        <w:rPr>
+          <w:rFonts w:ascii="Consolas" w:hAnsi="Consolas"/>
+          <w:b w:val="0"/>
+          <w:i w:val="0"/>
+          <w:color w:val="1F1F1F"/>
+          <w:sz w:val="18"/>
+        </w:rPr>
+        <w:t xml:space="preserve">            return;</w:t>
+        <w:br/>
+      </w:r>
+      <w:r>
+        <w:rPr>
+          <w:rFonts w:ascii="Consolas" w:hAnsi="Consolas"/>
+          <w:b w:val="0"/>
+          <w:i w:val="0"/>
+          <w:color w:val="1F1F1F"/>
+          <w:sz w:val="18"/>
+        </w:rPr>
+        <w:t xml:space="preserve">        }</w:t>
+        <w:br/>
+      </w:r>
+      <w:r>
+        <w:rPr>
+          <w:rFonts w:ascii="Consolas" w:hAnsi="Consolas"/>
+          <w:b w:val="0"/>
+          <w:i w:val="0"/>
+          <w:color w:val="1F1F1F"/>
+          <w:sz w:val="18"/>
+        </w:rPr>
+        <w:t xml:space="preserve">        if (!(valor &gt; 0)) {</w:t>
+        <w:br/>
+      </w:r>
+      <w:r>
+        <w:rPr>
+          <w:rFonts w:ascii="Consolas" w:hAnsi="Consolas"/>
+          <w:b w:val="0"/>
+          <w:i w:val="0"/>
+          <w:color w:val="1F1F1F"/>
+          <w:sz w:val="18"/>
+        </w:rPr>
+        <w:t xml:space="preserve">            System.out.println("Valor inválido");</w:t>
+        <w:br/>
+      </w:r>
+      <w:r>
+        <w:rPr>
+          <w:rFonts w:ascii="Consolas" w:hAnsi="Consolas"/>
+          <w:b w:val="0"/>
+          <w:i w:val="0"/>
+          <w:color w:val="1F1F1F"/>
+          <w:sz w:val="18"/>
+        </w:rPr>
+        <w:t xml:space="preserve">            return;</w:t>
+        <w:br/>
+      </w:r>
+      <w:r>
+        <w:rPr>
+          <w:rFonts w:ascii="Consolas" w:hAnsi="Consolas"/>
+          <w:b w:val="0"/>
+          <w:i w:val="0"/>
+          <w:color w:val="1F1F1F"/>
+          <w:sz w:val="18"/>
+        </w:rPr>
+        <w:t xml:space="preserve">        }</w:t>
+        <w:br/>
+      </w:r>
+      <w:r>
+        <w:rPr>
+          <w:rFonts w:ascii="Consolas" w:hAnsi="Consolas"/>
+          <w:b w:val="0"/>
+          <w:i w:val="0"/>
+          <w:color w:val="1F1F1F"/>
+          <w:sz w:val="18"/>
+        </w:rPr>
+        <w:t xml:space="preserve">        if (cartao == null || cartao.length() != TAMANHO_CARTAO) {</w:t>
+        <w:br/>
+      </w:r>
+      <w:r>
+        <w:rPr>
+          <w:rFonts w:ascii="Consolas" w:hAnsi="Consolas"/>
+          <w:b w:val="0"/>
+          <w:i w:val="0"/>
+          <w:color w:val="1F1F1F"/>
+          <w:sz w:val="18"/>
+        </w:rPr>
+        <w:t xml:space="preserve">            System.out.println("Cartão inválido");</w:t>
+        <w:br/>
+      </w:r>
+      <w:r>
+        <w:rPr>
+          <w:rFonts w:ascii="Consolas" w:hAnsi="Consolas"/>
+          <w:b w:val="0"/>
+          <w:i w:val="0"/>
+          <w:color w:val="1F1F1F"/>
+          <w:sz w:val="18"/>
+        </w:rPr>
+        <w:t xml:space="preserve">            return;</w:t>
+        <w:br/>
+      </w:r>
+      <w:r>
+        <w:rPr>
+          <w:rFonts w:ascii="Consolas" w:hAnsi="Consolas"/>
+          <w:b w:val="0"/>
+          <w:i w:val="0"/>
+          <w:color w:val="1F1F1F"/>
+          <w:sz w:val="18"/>
+        </w:rPr>
+        <w:t xml:space="preserve">        }</w:t>
+        <w:br/>
+      </w:r>
+      <w:r>
+        <w:rPr>
+          <w:rFonts w:ascii="Consolas" w:hAnsi="Consolas"/>
+          <w:b w:val="0"/>
+          <w:i w:val="0"/>
+          <w:color w:val="1F1F1F"/>
+          <w:sz w:val="18"/>
+        </w:rPr>
+        <w:t xml:space="preserve">        processarTipo(tipo, valor);</w:t>
         <w:br/>
       </w:r>
       <w:r>
@@ -2807,7 +3301,6 @@
           <w:color w:val="1F1F1F"/>
           <w:sz w:val="18"/>
         </w:rPr>
-        <w:t xml:space="preserve">  }</w:t>
         <w:br/>
       </w:r>
       <w:r>
@@ -2818,6 +3311,7 @@
           <w:color w:val="1F1F1F"/>
           <w:sz w:val="18"/>
         </w:rPr>
+        <w:t xml:space="preserve">    private void processarTipo(String tipo, double valor) {</w:t>
         <w:br/>
       </w:r>
       <w:r>
@@ -2828,7 +3322,7 @@
           <w:color w:val="1F1F1F"/>
           <w:sz w:val="18"/>
         </w:rPr>
-        <w:t xml:space="preserve">  private double calcularTaxa(String tipo) {</w:t>
+        <w:t xml:space="preserve">        switch (tipo) {</w:t>
         <w:br/>
       </w:r>
       <w:r>
@@ -2839,7 +3333,7 @@
           <w:color w:val="1F1F1F"/>
           <w:sz w:val="18"/>
         </w:rPr>
-        <w:t xml:space="preserve">    switch (tipo) {</w:t>
+        <w:t xml:space="preserve">            case "credito":</w:t>
         <w:br/>
       </w:r>
       <w:r>
@@ -2850,7 +3344,7 @@
           <w:color w:val="1F1F1F"/>
           <w:sz w:val="18"/>
         </w:rPr>
-        <w:t xml:space="preserve">      case "credito":</w:t>
+        <w:t xml:space="preserve">                processarComTaxa("crédito", valor, TAXA_CREDITO);</w:t>
         <w:br/>
       </w:r>
       <w:r>
@@ -2861,7 +3355,7 @@
           <w:color w:val="1F1F1F"/>
           <w:sz w:val="18"/>
         </w:rPr>
-        <w:t xml:space="preserve">        return TAXA_CREDITO;</w:t>
+        <w:t xml:space="preserve">                break;</w:t>
         <w:br/>
       </w:r>
       <w:r>
@@ -2872,7 +3366,7 @@
           <w:color w:val="1F1F1F"/>
           <w:sz w:val="18"/>
         </w:rPr>
-        <w:t xml:space="preserve">      case "debito":</w:t>
+        <w:t xml:space="preserve">            case "debito":</w:t>
         <w:br/>
       </w:r>
       <w:r>
@@ -2883,7 +3377,7 @@
           <w:color w:val="1F1F1F"/>
           <w:sz w:val="18"/>
         </w:rPr>
-        <w:t xml:space="preserve">        return TAXA_DEBITO;</w:t>
+        <w:t xml:space="preserve">                processarComTaxa("débito", valor, TAXA_DEBITO);</w:t>
         <w:br/>
       </w:r>
       <w:r>
@@ -2894,7 +3388,7 @@
           <w:color w:val="1F1F1F"/>
           <w:sz w:val="18"/>
         </w:rPr>
-        <w:t xml:space="preserve">      case "pix":</w:t>
+        <w:t xml:space="preserve">                break;</w:t>
         <w:br/>
       </w:r>
       <w:r>
@@ -2905,7 +3399,7 @@
           <w:color w:val="1F1F1F"/>
           <w:sz w:val="18"/>
         </w:rPr>
-        <w:t xml:space="preserve">        return 0.0;</w:t>
+        <w:t xml:space="preserve">            case "pix":</w:t>
         <w:br/>
       </w:r>
       <w:r>
@@ -2916,7 +3410,7 @@
           <w:color w:val="1F1F1F"/>
           <w:sz w:val="18"/>
         </w:rPr>
-        <w:t xml:space="preserve">      default:</w:t>
+        <w:t xml:space="preserve">                System.out.println("Processando PIX de R$ " + valor);</w:t>
         <w:br/>
       </w:r>
       <w:r>
@@ -2927,7 +3421,51 @@
           <w:color w:val="1F1F1F"/>
           <w:sz w:val="18"/>
         </w:rPr>
-        <w:t xml:space="preserve">        throw new IllegalArgumentException("Tipo inválido: " + tipo);</w:t>
+        <w:t xml:space="preserve">                break;</w:t>
+        <w:br/>
+      </w:r>
+      <w:r>
+        <w:rPr>
+          <w:rFonts w:ascii="Consolas" w:hAnsi="Consolas"/>
+          <w:b w:val="0"/>
+          <w:i w:val="0"/>
+          <w:color w:val="1F1F1F"/>
+          <w:sz w:val="18"/>
+        </w:rPr>
+        <w:t xml:space="preserve">            default:</w:t>
+        <w:br/>
+      </w:r>
+      <w:r>
+        <w:rPr>
+          <w:rFonts w:ascii="Consolas" w:hAnsi="Consolas"/>
+          <w:b w:val="0"/>
+          <w:i w:val="0"/>
+          <w:color w:val="1F1F1F"/>
+          <w:sz w:val="18"/>
+        </w:rPr>
+        <w:t xml:space="preserve">                System.out.println("Tipo inválido");</w:t>
+        <w:br/>
+      </w:r>
+      <w:r>
+        <w:rPr>
+          <w:rFonts w:ascii="Consolas" w:hAnsi="Consolas"/>
+          <w:b w:val="0"/>
+          <w:i w:val="0"/>
+          <w:color w:val="1F1F1F"/>
+          <w:sz w:val="18"/>
+        </w:rPr>
+        <w:t xml:space="preserve">                break;</w:t>
+        <w:br/>
+      </w:r>
+      <w:r>
+        <w:rPr>
+          <w:rFonts w:ascii="Consolas" w:hAnsi="Consolas"/>
+          <w:b w:val="0"/>
+          <w:i w:val="0"/>
+          <w:color w:val="1F1F1F"/>
+          <w:sz w:val="18"/>
+        </w:rPr>
+        <w:t xml:space="preserve">        }</w:t>
         <w:br/>
       </w:r>
       <w:r>
@@ -2949,7 +3487,6 @@
           <w:color w:val="1F1F1F"/>
           <w:sz w:val="18"/>
         </w:rPr>
-        <w:t xml:space="preserve">  }</w:t>
         <w:br/>
       </w:r>
       <w:r>
@@ -2960,6 +3497,7 @@
           <w:color w:val="1F1F1F"/>
           <w:sz w:val="18"/>
         </w:rPr>
+        <w:t xml:space="preserve">    private void processarComTaxa(String descricao, double valor, double taxa) {</w:t>
         <w:br/>
       </w:r>
       <w:r>
@@ -2970,7 +3508,7 @@
           <w:color w:val="1F1F1F"/>
           <w:sz w:val="18"/>
         </w:rPr>
-        <w:t xml:space="preserve">  /**</w:t>
+        <w:t xml:space="preserve">        System.out.println("Processando " + descricao + " de R$ " + valor);</w:t>
         <w:br/>
       </w:r>
       <w:r>
@@ -2981,7 +3519,7 @@
           <w:color w:val="1F1F1F"/>
           <w:sz w:val="18"/>
         </w:rPr>
-        <w:t xml:space="preserve">   * Valida a senha do usuário.</w:t>
+        <w:t xml:space="preserve">        double total = valor + valor * taxa;</w:t>
         <w:br/>
       </w:r>
       <w:r>
@@ -2992,270 +3530,7 @@
           <w:color w:val="1F1F1F"/>
           <w:sz w:val="18"/>
         </w:rPr>
-        <w:t xml:space="preserve">   *</w:t>
-        <w:br/>
-      </w:r>
-      <w:r>
-        <w:rPr>
-          <w:rFonts w:ascii="Consolas" w:hAnsi="Consolas"/>
-          <w:b w:val="0"/>
-          <w:i w:val="0"/>
-          <w:color w:val="1F1F1F"/>
-          <w:sz w:val="18"/>
-        </w:rPr>
-        <w:t xml:space="preserve">   * Implementação real (ver projeto completo em depois/src/ProcessadorPagamento.java):</w:t>
-        <w:br/>
-      </w:r>
-      <w:r>
-        <w:rPr>
-          <w:rFonts w:ascii="Consolas" w:hAnsi="Consolas"/>
-          <w:b w:val="0"/>
-          <w:i w:val="0"/>
-          <w:color w:val="1F1F1F"/>
-          <w:sz w:val="18"/>
-        </w:rPr>
-        <w:t xml:space="preserve">   * PBKDF2-HMAC-SHA256 com salt aleatório em Base64, 600.000 iterações, 256 bits,</w:t>
-        <w:br/>
-      </w:r>
-      <w:r>
-        <w:rPr>
-          <w:rFonts w:ascii="Consolas" w:hAnsi="Consolas"/>
-          <w:b w:val="0"/>
-          <w:i w:val="0"/>
-          <w:color w:val="1F1F1F"/>
-          <w:sz w:val="18"/>
-        </w:rPr>
-        <w:t xml:space="preserve">   * comparação resistente a timing attack — conforme OWASP Password Storage</w:t>
-        <w:br/>
-      </w:r>
-      <w:r>
-        <w:rPr>
-          <w:rFonts w:ascii="Consolas" w:hAnsi="Consolas"/>
-          <w:b w:val="0"/>
-          <w:i w:val="0"/>
-          <w:color w:val="1F1F1F"/>
-          <w:sz w:val="18"/>
-        </w:rPr>
-        <w:t xml:space="preserve">   * Cheat Sheet. Substitui a comparação direta de texto puro por hash+salt</w:t>
-        <w:br/>
-      </w:r>
-      <w:r>
-        <w:rPr>
-          <w:rFonts w:ascii="Consolas" w:hAnsi="Consolas"/>
-          <w:b w:val="0"/>
-          <w:i w:val="0"/>
-          <w:color w:val="1F1F1F"/>
-          <w:sz w:val="18"/>
-        </w:rPr>
-        <w:t xml:space="preserve">   * fornecidos externamente.</w:t>
-        <w:br/>
-      </w:r>
-      <w:r>
-        <w:rPr>
-          <w:rFonts w:ascii="Consolas" w:hAnsi="Consolas"/>
-          <w:b w:val="0"/>
-          <w:i w:val="0"/>
-          <w:color w:val="1F1F1F"/>
-          <w:sz w:val="18"/>
-        </w:rPr>
-        <w:t xml:space="preserve">   *</w:t>
-        <w:br/>
-      </w:r>
-      <w:r>
-        <w:rPr>
-          <w:rFonts w:ascii="Consolas" w:hAnsi="Consolas"/>
-          <w:b w:val="0"/>
-          <w:i w:val="0"/>
-          <w:color w:val="1F1F1F"/>
-          <w:sz w:val="18"/>
-        </w:rPr>
-        <w:t xml:space="preserve">   * @param senha Senha a ser validada</w:t>
-        <w:br/>
-      </w:r>
-      <w:r>
-        <w:rPr>
-          <w:rFonts w:ascii="Consolas" w:hAnsi="Consolas"/>
-          <w:b w:val="0"/>
-          <w:i w:val="0"/>
-          <w:color w:val="1F1F1F"/>
-          <w:sz w:val="18"/>
-        </w:rPr>
-        <w:t xml:space="preserve">   * @return true se a senha estiver correta</w:t>
-        <w:br/>
-      </w:r>
-      <w:r>
-        <w:rPr>
-          <w:rFonts w:ascii="Consolas" w:hAnsi="Consolas"/>
-          <w:b w:val="0"/>
-          <w:i w:val="0"/>
-          <w:color w:val="1F1F1F"/>
-          <w:sz w:val="18"/>
-        </w:rPr>
-        <w:t xml:space="preserve">   */</w:t>
-        <w:br/>
-      </w:r>
-      <w:r>
-        <w:rPr>
-          <w:rFonts w:ascii="Consolas" w:hAnsi="Consolas"/>
-          <w:b w:val="0"/>
-          <w:i w:val="0"/>
-          <w:color w:val="1F1F1F"/>
-          <w:sz w:val="18"/>
-        </w:rPr>
-        <w:t xml:space="preserve">  public boolean validarSenha(String senha) {</w:t>
-        <w:br/>
-      </w:r>
-      <w:r>
-        <w:rPr>
-          <w:rFonts w:ascii="Consolas" w:hAnsi="Consolas"/>
-          <w:b w:val="0"/>
-          <w:i w:val="0"/>
-          <w:color w:val="1F1F1F"/>
-          <w:sz w:val="18"/>
-        </w:rPr>
-        <w:t xml:space="preserve">    // ver implementação completa no código-fonte do projeto</w:t>
-        <w:br/>
-      </w:r>
-      <w:r>
-        <w:rPr>
-          <w:rFonts w:ascii="Consolas" w:hAnsi="Consolas"/>
-          <w:b w:val="0"/>
-          <w:i w:val="0"/>
-          <w:color w:val="1F1F1F"/>
-          <w:sz w:val="18"/>
-        </w:rPr>
-        <w:t xml:space="preserve">    return validarComHashESalt(senha);</w:t>
-        <w:br/>
-      </w:r>
-      <w:r>
-        <w:rPr>
-          <w:rFonts w:ascii="Consolas" w:hAnsi="Consolas"/>
-          <w:b w:val="0"/>
-          <w:i w:val="0"/>
-          <w:color w:val="1F1F1F"/>
-          <w:sz w:val="18"/>
-        </w:rPr>
-        <w:t xml:space="preserve">  }</w:t>
-        <w:br/>
-      </w:r>
-      <w:r>
-        <w:rPr>
-          <w:rFonts w:ascii="Consolas" w:hAnsi="Consolas"/>
-          <w:b w:val="0"/>
-          <w:i w:val="0"/>
-          <w:color w:val="1F1F1F"/>
-          <w:sz w:val="18"/>
-        </w:rPr>
-        <w:br/>
-      </w:r>
-      <w:r>
-        <w:rPr>
-          <w:rFonts w:ascii="Consolas" w:hAnsi="Consolas"/>
-          <w:b w:val="0"/>
-          <w:i w:val="0"/>
-          <w:color w:val="1F1F1F"/>
-          <w:sz w:val="18"/>
-        </w:rPr>
-        <w:t xml:space="preserve">  /**</w:t>
-        <w:br/>
-      </w:r>
-      <w:r>
-        <w:rPr>
-          <w:rFonts w:ascii="Consolas" w:hAnsi="Consolas"/>
-          <w:b w:val="0"/>
-          <w:i w:val="0"/>
-          <w:color w:val="1F1F1F"/>
-          <w:sz w:val="18"/>
-        </w:rPr>
-        <w:t xml:space="preserve">   * Calcula o desconto com base na quantidade de itens.</w:t>
-        <w:br/>
-      </w:r>
-      <w:r>
-        <w:rPr>
-          <w:rFonts w:ascii="Consolas" w:hAnsi="Consolas"/>
-          <w:b w:val="0"/>
-          <w:i w:val="0"/>
-          <w:color w:val="1F1F1F"/>
-          <w:sz w:val="18"/>
-        </w:rPr>
-        <w:t xml:space="preserve">   *</w:t>
-        <w:br/>
-      </w:r>
-      <w:r>
-        <w:rPr>
-          <w:rFonts w:ascii="Consolas" w:hAnsi="Consolas"/>
-          <w:b w:val="0"/>
-          <w:i w:val="0"/>
-          <w:color w:val="1F1F1F"/>
-          <w:sz w:val="18"/>
-        </w:rPr>
-        <w:t xml:space="preserve">   * @param quantidade Quantidade de itens</w:t>
-        <w:br/>
-      </w:r>
-      <w:r>
-        <w:rPr>
-          <w:rFonts w:ascii="Consolas" w:hAnsi="Consolas"/>
-          <w:b w:val="0"/>
-          <w:i w:val="0"/>
-          <w:color w:val="1F1F1F"/>
-          <w:sz w:val="18"/>
-        </w:rPr>
-        <w:t xml:space="preserve">   * @param preco      Preço unitário</w:t>
-        <w:br/>
-      </w:r>
-      <w:r>
-        <w:rPr>
-          <w:rFonts w:ascii="Consolas" w:hAnsi="Consolas"/>
-          <w:b w:val="0"/>
-          <w:i w:val="0"/>
-          <w:color w:val="1F1F1F"/>
-          <w:sz w:val="18"/>
-        </w:rPr>
-        <w:t xml:space="preserve">   * @return Valor total com desconto aplicado</w:t>
-        <w:br/>
-      </w:r>
-      <w:r>
-        <w:rPr>
-          <w:rFonts w:ascii="Consolas" w:hAnsi="Consolas"/>
-          <w:b w:val="0"/>
-          <w:i w:val="0"/>
-          <w:color w:val="1F1F1F"/>
-          <w:sz w:val="18"/>
-        </w:rPr>
-        <w:t xml:space="preserve">   */</w:t>
-        <w:br/>
-      </w:r>
-      <w:r>
-        <w:rPr>
-          <w:rFonts w:ascii="Consolas" w:hAnsi="Consolas"/>
-          <w:b w:val="0"/>
-          <w:i w:val="0"/>
-          <w:color w:val="1F1F1F"/>
-          <w:sz w:val="18"/>
-        </w:rPr>
-        <w:t xml:space="preserve">  public double calcularDesconto(int quantidade, double preco) {</w:t>
-        <w:br/>
-      </w:r>
-      <w:r>
-        <w:rPr>
-          <w:rFonts w:ascii="Consolas" w:hAnsi="Consolas"/>
-          <w:b w:val="0"/>
-          <w:i w:val="0"/>
-          <w:color w:val="1F1F1F"/>
-          <w:sz w:val="18"/>
-        </w:rPr>
-        <w:t xml:space="preserve">    if (quantidade &lt;= 0) {</w:t>
-        <w:br/>
-      </w:r>
-      <w:r>
-        <w:rPr>
-          <w:rFonts w:ascii="Consolas" w:hAnsi="Consolas"/>
-          <w:b w:val="0"/>
-          <w:i w:val="0"/>
-          <w:color w:val="1F1F1F"/>
-          <w:sz w:val="18"/>
-        </w:rPr>
-        <w:t xml:space="preserve">      return 0;</w:t>
+        <w:t xml:space="preserve">        System.out.println("Total com taxa: R$ " + total);</w:t>
         <w:br/>
       </w:r>
       <w:r>
@@ -3277,7 +3552,6 @@
           <w:color w:val="1F1F1F"/>
           <w:sz w:val="18"/>
         </w:rPr>
-        <w:t xml:space="preserve">    if (quantidade &gt;= DESCONTO_30) {</w:t>
         <w:br/>
       </w:r>
       <w:r>
@@ -3288,7 +3562,304 @@
           <w:color w:val="1F1F1F"/>
           <w:sz w:val="18"/>
         </w:rPr>
-        <w:t xml:space="preserve">      return preco * quantidade * 0.7;</w:t>
+        <w:t xml:space="preserve">    /**</w:t>
+        <w:br/>
+      </w:r>
+      <w:r>
+        <w:rPr>
+          <w:rFonts w:ascii="Consolas" w:hAnsi="Consolas"/>
+          <w:b w:val="0"/>
+          <w:i w:val="0"/>
+          <w:color w:val="1F1F1F"/>
+          <w:sz w:val="18"/>
+        </w:rPr>
+        <w:t xml:space="preserve">     * Verifica a senha por derivacao PBKDF2 e comparacao dos bytes do hash.</w:t>
+        <w:br/>
+      </w:r>
+      <w:r>
+        <w:rPr>
+          <w:rFonts w:ascii="Consolas" w:hAnsi="Consolas"/>
+          <w:b w:val="0"/>
+          <w:i w:val="0"/>
+          <w:color w:val="1F1F1F"/>
+          <w:sz w:val="18"/>
+        </w:rPr>
+        <w:t xml:space="preserve">     *</w:t>
+        <w:br/>
+      </w:r>
+      <w:r>
+        <w:rPr>
+          <w:rFonts w:ascii="Consolas" w:hAnsi="Consolas"/>
+          <w:b w:val="0"/>
+          <w:i w:val="0"/>
+          <w:color w:val="1F1F1F"/>
+          <w:sz w:val="18"/>
+        </w:rPr>
+        <w:t xml:space="preserve">     * @param senha senha informada pelo chamador</w:t>
+        <w:br/>
+      </w:r>
+      <w:r>
+        <w:rPr>
+          <w:rFonts w:ascii="Consolas" w:hAnsi="Consolas"/>
+          <w:b w:val="0"/>
+          <w:i w:val="0"/>
+          <w:color w:val="1F1F1F"/>
+          <w:sz w:val="18"/>
+        </w:rPr>
+        <w:t xml:space="preserve">     * @return true quando a credencial coincide; false para senha nula ou incorreta</w:t>
+        <w:br/>
+      </w:r>
+      <w:r>
+        <w:rPr>
+          <w:rFonts w:ascii="Consolas" w:hAnsi="Consolas"/>
+          <w:b w:val="0"/>
+          <w:i w:val="0"/>
+          <w:color w:val="1F1F1F"/>
+          <w:sz w:val="18"/>
+        </w:rPr>
+        <w:t xml:space="preserve">     * @throws IllegalStateException se o algoritmo de derivacao nao estiver disponivel</w:t>
+        <w:br/>
+      </w:r>
+      <w:r>
+        <w:rPr>
+          <w:rFonts w:ascii="Consolas" w:hAnsi="Consolas"/>
+          <w:b w:val="0"/>
+          <w:i w:val="0"/>
+          <w:color w:val="1F1F1F"/>
+          <w:sz w:val="18"/>
+        </w:rPr>
+        <w:t xml:space="preserve">     */</w:t>
+        <w:br/>
+      </w:r>
+      <w:r>
+        <w:rPr>
+          <w:rFonts w:ascii="Consolas" w:hAnsi="Consolas"/>
+          <w:b w:val="0"/>
+          <w:i w:val="0"/>
+          <w:color w:val="1F1F1F"/>
+          <w:sz w:val="18"/>
+        </w:rPr>
+        <w:t xml:space="preserve">    public boolean validarSenha(String senha) {</w:t>
+        <w:br/>
+      </w:r>
+      <w:r>
+        <w:rPr>
+          <w:rFonts w:ascii="Consolas" w:hAnsi="Consolas"/>
+          <w:b w:val="0"/>
+          <w:i w:val="0"/>
+          <w:color w:val="1F1F1F"/>
+          <w:sz w:val="18"/>
+        </w:rPr>
+        <w:t xml:space="preserve">        if (senha == null) {</w:t>
+        <w:br/>
+      </w:r>
+      <w:r>
+        <w:rPr>
+          <w:rFonts w:ascii="Consolas" w:hAnsi="Consolas"/>
+          <w:b w:val="0"/>
+          <w:i w:val="0"/>
+          <w:color w:val="1F1F1F"/>
+          <w:sz w:val="18"/>
+        </w:rPr>
+        <w:t xml:space="preserve">            return false;</w:t>
+        <w:br/>
+      </w:r>
+      <w:r>
+        <w:rPr>
+          <w:rFonts w:ascii="Consolas" w:hAnsi="Consolas"/>
+          <w:b w:val="0"/>
+          <w:i w:val="0"/>
+          <w:color w:val="1F1F1F"/>
+          <w:sz w:val="18"/>
+        </w:rPr>
+        <w:t xml:space="preserve">        }</w:t>
+        <w:br/>
+      </w:r>
+      <w:r>
+        <w:rPr>
+          <w:rFonts w:ascii="Consolas" w:hAnsi="Consolas"/>
+          <w:b w:val="0"/>
+          <w:i w:val="0"/>
+          <w:color w:val="1F1F1F"/>
+          <w:sz w:val="18"/>
+        </w:rPr>
+        <w:t xml:space="preserve">        char[] caracteres = senha.toCharArray();</w:t>
+        <w:br/>
+      </w:r>
+      <w:r>
+        <w:rPr>
+          <w:rFonts w:ascii="Consolas" w:hAnsi="Consolas"/>
+          <w:b w:val="0"/>
+          <w:i w:val="0"/>
+          <w:color w:val="1F1F1F"/>
+          <w:sz w:val="18"/>
+        </w:rPr>
+        <w:t xml:space="preserve">        PBEKeySpec especificacao = new PBEKeySpec(</w:t>
+        <w:br/>
+      </w:r>
+      <w:r>
+        <w:rPr>
+          <w:rFonts w:ascii="Consolas" w:hAnsi="Consolas"/>
+          <w:b w:val="0"/>
+          <w:i w:val="0"/>
+          <w:color w:val="1F1F1F"/>
+          <w:sz w:val="18"/>
+        </w:rPr>
+        <w:t xml:space="preserve">                caracteres, salt, ITERACOES_PBKDF2, TAMANHO_HASH_BITS);</w:t>
+        <w:br/>
+      </w:r>
+      <w:r>
+        <w:rPr>
+          <w:rFonts w:ascii="Consolas" w:hAnsi="Consolas"/>
+          <w:b w:val="0"/>
+          <w:i w:val="0"/>
+          <w:color w:val="1F1F1F"/>
+          <w:sz w:val="18"/>
+        </w:rPr>
+        <w:t xml:space="preserve">        try {</w:t>
+        <w:br/>
+      </w:r>
+      <w:r>
+        <w:rPr>
+          <w:rFonts w:ascii="Consolas" w:hAnsi="Consolas"/>
+          <w:b w:val="0"/>
+          <w:i w:val="0"/>
+          <w:color w:val="1F1F1F"/>
+          <w:sz w:val="18"/>
+        </w:rPr>
+        <w:t xml:space="preserve">            SecretKeyFactory fabrica = SecretKeyFactory.getInstance(ALGORITMO_SENHA);</w:t>
+        <w:br/>
+      </w:r>
+      <w:r>
+        <w:rPr>
+          <w:rFonts w:ascii="Consolas" w:hAnsi="Consolas"/>
+          <w:b w:val="0"/>
+          <w:i w:val="0"/>
+          <w:color w:val="1F1F1F"/>
+          <w:sz w:val="18"/>
+        </w:rPr>
+        <w:t xml:space="preserve">            byte[] hashInformado = fabrica.generateSecret(especificacao).getEncoded();</w:t>
+        <w:br/>
+      </w:r>
+      <w:r>
+        <w:rPr>
+          <w:rFonts w:ascii="Consolas" w:hAnsi="Consolas"/>
+          <w:b w:val="0"/>
+          <w:i w:val="0"/>
+          <w:color w:val="1F1F1F"/>
+          <w:sz w:val="18"/>
+        </w:rPr>
+        <w:t xml:space="preserve">            try {</w:t>
+        <w:br/>
+      </w:r>
+      <w:r>
+        <w:rPr>
+          <w:rFonts w:ascii="Consolas" w:hAnsi="Consolas"/>
+          <w:b w:val="0"/>
+          <w:i w:val="0"/>
+          <w:color w:val="1F1F1F"/>
+          <w:sz w:val="18"/>
+        </w:rPr>
+        <w:t xml:space="preserve">                return MessageDigest.isEqual(hashEsperado, hashInformado);</w:t>
+        <w:br/>
+      </w:r>
+      <w:r>
+        <w:rPr>
+          <w:rFonts w:ascii="Consolas" w:hAnsi="Consolas"/>
+          <w:b w:val="0"/>
+          <w:i w:val="0"/>
+          <w:color w:val="1F1F1F"/>
+          <w:sz w:val="18"/>
+        </w:rPr>
+        <w:t xml:space="preserve">            } finally {</w:t>
+        <w:br/>
+      </w:r>
+      <w:r>
+        <w:rPr>
+          <w:rFonts w:ascii="Consolas" w:hAnsi="Consolas"/>
+          <w:b w:val="0"/>
+          <w:i w:val="0"/>
+          <w:color w:val="1F1F1F"/>
+          <w:sz w:val="18"/>
+        </w:rPr>
+        <w:t xml:space="preserve">                Arrays.fill(hashInformado, (byte) 0);</w:t>
+        <w:br/>
+      </w:r>
+      <w:r>
+        <w:rPr>
+          <w:rFonts w:ascii="Consolas" w:hAnsi="Consolas"/>
+          <w:b w:val="0"/>
+          <w:i w:val="0"/>
+          <w:color w:val="1F1F1F"/>
+          <w:sz w:val="18"/>
+        </w:rPr>
+        <w:t xml:space="preserve">            }</w:t>
+        <w:br/>
+      </w:r>
+      <w:r>
+        <w:rPr>
+          <w:rFonts w:ascii="Consolas" w:hAnsi="Consolas"/>
+          <w:b w:val="0"/>
+          <w:i w:val="0"/>
+          <w:color w:val="1F1F1F"/>
+          <w:sz w:val="18"/>
+        </w:rPr>
+        <w:t xml:space="preserve">        } catch (NoSuchAlgorithmException | InvalidKeySpecException erro) {</w:t>
+        <w:br/>
+      </w:r>
+      <w:r>
+        <w:rPr>
+          <w:rFonts w:ascii="Consolas" w:hAnsi="Consolas"/>
+          <w:b w:val="0"/>
+          <w:i w:val="0"/>
+          <w:color w:val="1F1F1F"/>
+          <w:sz w:val="18"/>
+        </w:rPr>
+        <w:t xml:space="preserve">            throw new IllegalStateException("Falha ao verificar credencial", erro);</w:t>
+        <w:br/>
+      </w:r>
+      <w:r>
+        <w:rPr>
+          <w:rFonts w:ascii="Consolas" w:hAnsi="Consolas"/>
+          <w:b w:val="0"/>
+          <w:i w:val="0"/>
+          <w:color w:val="1F1F1F"/>
+          <w:sz w:val="18"/>
+        </w:rPr>
+        <w:t xml:space="preserve">        } finally {</w:t>
+        <w:br/>
+      </w:r>
+      <w:r>
+        <w:rPr>
+          <w:rFonts w:ascii="Consolas" w:hAnsi="Consolas"/>
+          <w:b w:val="0"/>
+          <w:i w:val="0"/>
+          <w:color w:val="1F1F1F"/>
+          <w:sz w:val="18"/>
+        </w:rPr>
+        <w:t xml:space="preserve">            especificacao.clearPassword();</w:t>
+        <w:br/>
+      </w:r>
+      <w:r>
+        <w:rPr>
+          <w:rFonts w:ascii="Consolas" w:hAnsi="Consolas"/>
+          <w:b w:val="0"/>
+          <w:i w:val="0"/>
+          <w:color w:val="1F1F1F"/>
+          <w:sz w:val="18"/>
+        </w:rPr>
+        <w:t xml:space="preserve">            Arrays.fill(caracteres, '\0');</w:t>
+        <w:br/>
+      </w:r>
+      <w:r>
+        <w:rPr>
+          <w:rFonts w:ascii="Consolas" w:hAnsi="Consolas"/>
+          <w:b w:val="0"/>
+          <w:i w:val="0"/>
+          <w:color w:val="1F1F1F"/>
+          <w:sz w:val="18"/>
+        </w:rPr>
+        <w:t xml:space="preserve">        }</w:t>
         <w:br/>
       </w:r>
       <w:r>
@@ -3310,7 +3881,6 @@
           <w:color w:val="1F1F1F"/>
           <w:sz w:val="18"/>
         </w:rPr>
-        <w:t xml:space="preserve">    if (quantidade &gt;= DESCONTO_20) {</w:t>
         <w:br/>
       </w:r>
       <w:r>
@@ -3321,7 +3891,227 @@
           <w:color w:val="1F1F1F"/>
           <w:sz w:val="18"/>
         </w:rPr>
-        <w:t xml:space="preserve">      return preco * quantidade * 0.8;</w:t>
+        <w:t xml:space="preserve">    /**</w:t>
+        <w:br/>
+      </w:r>
+      <w:r>
+        <w:rPr>
+          <w:rFonts w:ascii="Consolas" w:hAnsi="Consolas"/>
+          <w:b w:val="0"/>
+          <w:i w:val="0"/>
+          <w:color w:val="1F1F1F"/>
+          <w:sz w:val="18"/>
+        </w:rPr>
+        <w:t xml:space="preserve">     * Calcula o total com desconto progressivo de acordo com a quantidade.</w:t>
+        <w:br/>
+      </w:r>
+      <w:r>
+        <w:rPr>
+          <w:rFonts w:ascii="Consolas" w:hAnsi="Consolas"/>
+          <w:b w:val="0"/>
+          <w:i w:val="0"/>
+          <w:color w:val="1F1F1F"/>
+          <w:sz w:val="18"/>
+        </w:rPr>
+        <w:t xml:space="preserve">     *</w:t>
+        <w:br/>
+      </w:r>
+      <w:r>
+        <w:rPr>
+          <w:rFonts w:ascii="Consolas" w:hAnsi="Consolas"/>
+          <w:b w:val="0"/>
+          <w:i w:val="0"/>
+          <w:color w:val="1F1F1F"/>
+          <w:sz w:val="18"/>
+        </w:rPr>
+        <w:t xml:space="preserve">     * @param quantidade quantidade de itens</w:t>
+        <w:br/>
+      </w:r>
+      <w:r>
+        <w:rPr>
+          <w:rFonts w:ascii="Consolas" w:hAnsi="Consolas"/>
+          <w:b w:val="0"/>
+          <w:i w:val="0"/>
+          <w:color w:val="1F1F1F"/>
+          <w:sz w:val="18"/>
+        </w:rPr>
+        <w:t xml:space="preserve">     * @param preco preco unitario</w:t>
+        <w:br/>
+      </w:r>
+      <w:r>
+        <w:rPr>
+          <w:rFonts w:ascii="Consolas" w:hAnsi="Consolas"/>
+          <w:b w:val="0"/>
+          <w:i w:val="0"/>
+          <w:color w:val="1F1F1F"/>
+          <w:sz w:val="18"/>
+        </w:rPr>
+        <w:t xml:space="preserve">     * @return zero para quantidade nao positiva; total com o desconto aplicavel nos demais casos</w:t>
+        <w:br/>
+      </w:r>
+      <w:r>
+        <w:rPr>
+          <w:rFonts w:ascii="Consolas" w:hAnsi="Consolas"/>
+          <w:b w:val="0"/>
+          <w:i w:val="0"/>
+          <w:color w:val="1F1F1F"/>
+          <w:sz w:val="18"/>
+        </w:rPr>
+        <w:t xml:space="preserve">     */</w:t>
+        <w:br/>
+      </w:r>
+      <w:r>
+        <w:rPr>
+          <w:rFonts w:ascii="Consolas" w:hAnsi="Consolas"/>
+          <w:b w:val="0"/>
+          <w:i w:val="0"/>
+          <w:color w:val="1F1F1F"/>
+          <w:sz w:val="18"/>
+        </w:rPr>
+        <w:t xml:space="preserve">    public double calcularDesconto(int quantidade, double preco) {</w:t>
+        <w:br/>
+      </w:r>
+      <w:r>
+        <w:rPr>
+          <w:rFonts w:ascii="Consolas" w:hAnsi="Consolas"/>
+          <w:b w:val="0"/>
+          <w:i w:val="0"/>
+          <w:color w:val="1F1F1F"/>
+          <w:sz w:val="18"/>
+        </w:rPr>
+        <w:t xml:space="preserve">        if (quantidade &lt;= 0) {</w:t>
+        <w:br/>
+      </w:r>
+      <w:r>
+        <w:rPr>
+          <w:rFonts w:ascii="Consolas" w:hAnsi="Consolas"/>
+          <w:b w:val="0"/>
+          <w:i w:val="0"/>
+          <w:color w:val="1F1F1F"/>
+          <w:sz w:val="18"/>
+        </w:rPr>
+        <w:t xml:space="preserve">            return 0;</w:t>
+        <w:br/>
+      </w:r>
+      <w:r>
+        <w:rPr>
+          <w:rFonts w:ascii="Consolas" w:hAnsi="Consolas"/>
+          <w:b w:val="0"/>
+          <w:i w:val="0"/>
+          <w:color w:val="1F1F1F"/>
+          <w:sz w:val="18"/>
+        </w:rPr>
+        <w:t xml:space="preserve">        }</w:t>
+        <w:br/>
+      </w:r>
+      <w:r>
+        <w:rPr>
+          <w:rFonts w:ascii="Consolas" w:hAnsi="Consolas"/>
+          <w:b w:val="0"/>
+          <w:i w:val="0"/>
+          <w:color w:val="1F1F1F"/>
+          <w:sz w:val="18"/>
+        </w:rPr>
+        <w:t xml:space="preserve">        if (quantidade &gt;= LIMITE_DESCONTO_30) {</w:t>
+        <w:br/>
+      </w:r>
+      <w:r>
+        <w:rPr>
+          <w:rFonts w:ascii="Consolas" w:hAnsi="Consolas"/>
+          <w:b w:val="0"/>
+          <w:i w:val="0"/>
+          <w:color w:val="1F1F1F"/>
+          <w:sz w:val="18"/>
+        </w:rPr>
+        <w:t xml:space="preserve">            return preco * quantidade * FATOR_DESCONTO_30;</w:t>
+        <w:br/>
+      </w:r>
+      <w:r>
+        <w:rPr>
+          <w:rFonts w:ascii="Consolas" w:hAnsi="Consolas"/>
+          <w:b w:val="0"/>
+          <w:i w:val="0"/>
+          <w:color w:val="1F1F1F"/>
+          <w:sz w:val="18"/>
+        </w:rPr>
+        <w:t xml:space="preserve">        }</w:t>
+        <w:br/>
+      </w:r>
+      <w:r>
+        <w:rPr>
+          <w:rFonts w:ascii="Consolas" w:hAnsi="Consolas"/>
+          <w:b w:val="0"/>
+          <w:i w:val="0"/>
+          <w:color w:val="1F1F1F"/>
+          <w:sz w:val="18"/>
+        </w:rPr>
+        <w:t xml:space="preserve">        if (quantidade &gt;= LIMITE_DESCONTO_20) {</w:t>
+        <w:br/>
+      </w:r>
+      <w:r>
+        <w:rPr>
+          <w:rFonts w:ascii="Consolas" w:hAnsi="Consolas"/>
+          <w:b w:val="0"/>
+          <w:i w:val="0"/>
+          <w:color w:val="1F1F1F"/>
+          <w:sz w:val="18"/>
+        </w:rPr>
+        <w:t xml:space="preserve">            return preco * quantidade * FATOR_DESCONTO_20;</w:t>
+        <w:br/>
+      </w:r>
+      <w:r>
+        <w:rPr>
+          <w:rFonts w:ascii="Consolas" w:hAnsi="Consolas"/>
+          <w:b w:val="0"/>
+          <w:i w:val="0"/>
+          <w:color w:val="1F1F1F"/>
+          <w:sz w:val="18"/>
+        </w:rPr>
+        <w:t xml:space="preserve">        }</w:t>
+        <w:br/>
+      </w:r>
+      <w:r>
+        <w:rPr>
+          <w:rFonts w:ascii="Consolas" w:hAnsi="Consolas"/>
+          <w:b w:val="0"/>
+          <w:i w:val="0"/>
+          <w:color w:val="1F1F1F"/>
+          <w:sz w:val="18"/>
+        </w:rPr>
+        <w:t xml:space="preserve">        if (quantidade &gt;= LIMITE_DESCONTO_10) {</w:t>
+        <w:br/>
+      </w:r>
+      <w:r>
+        <w:rPr>
+          <w:rFonts w:ascii="Consolas" w:hAnsi="Consolas"/>
+          <w:b w:val="0"/>
+          <w:i w:val="0"/>
+          <w:color w:val="1F1F1F"/>
+          <w:sz w:val="18"/>
+        </w:rPr>
+        <w:t xml:space="preserve">            return preco * quantidade * FATOR_DESCONTO_10;</w:t>
+        <w:br/>
+      </w:r>
+      <w:r>
+        <w:rPr>
+          <w:rFonts w:ascii="Consolas" w:hAnsi="Consolas"/>
+          <w:b w:val="0"/>
+          <w:i w:val="0"/>
+          <w:color w:val="1F1F1F"/>
+          <w:sz w:val="18"/>
+        </w:rPr>
+        <w:t xml:space="preserve">        }</w:t>
+        <w:br/>
+      </w:r>
+      <w:r>
+        <w:rPr>
+          <w:rFonts w:ascii="Consolas" w:hAnsi="Consolas"/>
+          <w:b w:val="0"/>
+          <w:i w:val="0"/>
+          <w:color w:val="1F1F1F"/>
+          <w:sz w:val="18"/>
+        </w:rPr>
+        <w:t xml:space="preserve">        return preco * quantidade;</w:t>
         <w:br/>
       </w:r>
       <w:r>
@@ -3333,61 +4123,6 @@
           <w:sz w:val="18"/>
         </w:rPr>
         <w:t xml:space="preserve">    }</w:t>
-        <w:br/>
-      </w:r>
-      <w:r>
-        <w:rPr>
-          <w:rFonts w:ascii="Consolas" w:hAnsi="Consolas"/>
-          <w:b w:val="0"/>
-          <w:i w:val="0"/>
-          <w:color w:val="1F1F1F"/>
-          <w:sz w:val="18"/>
-        </w:rPr>
-        <w:t xml:space="preserve">    if (quantidade &gt;= DESCONTO_10) {</w:t>
-        <w:br/>
-      </w:r>
-      <w:r>
-        <w:rPr>
-          <w:rFonts w:ascii="Consolas" w:hAnsi="Consolas"/>
-          <w:b w:val="0"/>
-          <w:i w:val="0"/>
-          <w:color w:val="1F1F1F"/>
-          <w:sz w:val="18"/>
-        </w:rPr>
-        <w:t xml:space="preserve">      return preco * quantidade * 0.9;</w:t>
-        <w:br/>
-      </w:r>
-      <w:r>
-        <w:rPr>
-          <w:rFonts w:ascii="Consolas" w:hAnsi="Consolas"/>
-          <w:b w:val="0"/>
-          <w:i w:val="0"/>
-          <w:color w:val="1F1F1F"/>
-          <w:sz w:val="18"/>
-        </w:rPr>
-        <w:t xml:space="preserve">    }</w:t>
-        <w:br/>
-      </w:r>
-      <w:r>
-        <w:rPr>
-          <w:rFonts w:ascii="Consolas" w:hAnsi="Consolas"/>
-          <w:b w:val="0"/>
-          <w:i w:val="0"/>
-          <w:color w:val="1F1F1F"/>
-          <w:sz w:val="18"/>
-        </w:rPr>
-        <w:t xml:space="preserve">    return preco * quantidade;</w:t>
-        <w:br/>
-      </w:r>
-      <w:r>
-        <w:rPr>
-          <w:rFonts w:ascii="Consolas" w:hAnsi="Consolas"/>
-          <w:b w:val="0"/>
-          <w:i w:val="0"/>
-          <w:color w:val="1F1F1F"/>
-          <w:sz w:val="18"/>
-        </w:rPr>
-        <w:t xml:space="preserve">  }</w:t>
         <w:br/>
       </w:r>
       <w:r>

</xml_diff>